<commit_message>
feat: enhance gpa agent with course-level semester gpa calculator and rich Q&A
</commit_message>
<xml_diff>
--- a/subspaces/01-academic-training/gpa-academic-standing-agent/info.docx
+++ b/subspaces/01-academic-training/gpa-academic-standing-agent/info.docx
@@ -66,10 +66,10 @@
             <w:tcW w:type="dxa" w:w="3168"/>
             <w:shd w:fill="003366"/>
             <w:tcMar>
-              <w:top w:w="110" w:type="dxa"/>
-              <w:bottom w:w="110" w:type="dxa"/>
-              <w:left w:w="130" w:type="dxa"/>
-              <w:right w:w="130" w:type="dxa"/>
+              <w:top w:w="100" w:type="dxa"/>
+              <w:bottom w:w="100" w:type="dxa"/>
+              <w:left w:w="120" w:type="dxa"/>
+              <w:right w:w="120" w:type="dxa"/>
             </w:tcMar>
           </w:tcPr>
           <w:p>
@@ -92,10 +92,10 @@
             <w:tcW w:type="dxa" w:w="6192"/>
             <w:shd w:fill="003366"/>
             <w:tcMar>
-              <w:top w:w="110" w:type="dxa"/>
-              <w:bottom w:w="110" w:type="dxa"/>
-              <w:left w:w="130" w:type="dxa"/>
-              <w:right w:w="130" w:type="dxa"/>
+              <w:top w:w="100" w:type="dxa"/>
+              <w:bottom w:w="100" w:type="dxa"/>
+              <w:left w:w="120" w:type="dxa"/>
+              <w:right w:w="120" w:type="dxa"/>
             </w:tcMar>
           </w:tcPr>
           <w:p>
@@ -120,8 +120,8 @@
             <w:tcW w:type="dxa" w:w="3168"/>
             <w:shd w:fill="FFFFFF"/>
             <w:tcMar>
-              <w:top w:w="85" w:type="dxa"/>
-              <w:bottom w:w="85" w:type="dxa"/>
+              <w:top w:w="80" w:type="dxa"/>
+              <w:bottom w:w="80" w:type="dxa"/>
               <w:left w:w="120" w:type="dxa"/>
               <w:right w:w="120" w:type="dxa"/>
             </w:tcMar>
@@ -144,8 +144,8 @@
             <w:tcW w:type="dxa" w:w="6192"/>
             <w:shd w:fill="FFFFFF"/>
             <w:tcMar>
-              <w:top w:w="85" w:type="dxa"/>
-              <w:bottom w:w="85" w:type="dxa"/>
+              <w:top w:w="80" w:type="dxa"/>
+              <w:bottom w:w="80" w:type="dxa"/>
               <w:left w:w="120" w:type="dxa"/>
               <w:right w:w="120" w:type="dxa"/>
             </w:tcMar>
@@ -159,7 +159,7 @@
                 <w:rFonts w:ascii="Arial" w:hAnsi="Arial"/>
                 <w:sz w:val="18"/>
               </w:rPr>
-              <w:t>GPA &amp; Academic Standing Agent (Trợ lý Điểm số &amp; Tình trạng Học vụ)</w:t>
+              <w:t>GPA &amp; Academic Standing Agent (Trợ lý Điểm số, Tính GPA Môn học &amp; Tình trạng Học vụ)</w:t>
             </w:r>
           </w:p>
         </w:tc>
@@ -170,8 +170,8 @@
             <w:tcW w:type="dxa" w:w="3168"/>
             <w:shd w:fill="F4F8FA"/>
             <w:tcMar>
-              <w:top w:w="85" w:type="dxa"/>
-              <w:bottom w:w="85" w:type="dxa"/>
+              <w:top w:w="80" w:type="dxa"/>
+              <w:bottom w:w="80" w:type="dxa"/>
               <w:left w:w="120" w:type="dxa"/>
               <w:right w:w="120" w:type="dxa"/>
             </w:tcMar>
@@ -194,8 +194,8 @@
             <w:tcW w:type="dxa" w:w="6192"/>
             <w:shd w:fill="F4F8FA"/>
             <w:tcMar>
-              <w:top w:w="85" w:type="dxa"/>
-              <w:bottom w:w="85" w:type="dxa"/>
+              <w:top w:w="80" w:type="dxa"/>
+              <w:bottom w:w="80" w:type="dxa"/>
               <w:left w:w="120" w:type="dxa"/>
               <w:right w:w="120" w:type="dxa"/>
             </w:tcMar>
@@ -220,8 +220,8 @@
             <w:tcW w:type="dxa" w:w="3168"/>
             <w:shd w:fill="FFFFFF"/>
             <w:tcMar>
-              <w:top w:w="85" w:type="dxa"/>
-              <w:bottom w:w="85" w:type="dxa"/>
+              <w:top w:w="80" w:type="dxa"/>
+              <w:bottom w:w="80" w:type="dxa"/>
               <w:left w:w="120" w:type="dxa"/>
               <w:right w:w="120" w:type="dxa"/>
             </w:tcMar>
@@ -244,8 +244,8 @@
             <w:tcW w:type="dxa" w:w="6192"/>
             <w:shd w:fill="FFFFFF"/>
             <w:tcMar>
-              <w:top w:w="85" w:type="dxa"/>
-              <w:bottom w:w="85" w:type="dxa"/>
+              <w:top w:w="80" w:type="dxa"/>
+              <w:bottom w:w="80" w:type="dxa"/>
               <w:left w:w="120" w:type="dxa"/>
               <w:right w:w="120" w:type="dxa"/>
             </w:tcMar>
@@ -270,8 +270,8 @@
             <w:tcW w:type="dxa" w:w="3168"/>
             <w:shd w:fill="F4F8FA"/>
             <w:tcMar>
-              <w:top w:w="85" w:type="dxa"/>
-              <w:bottom w:w="85" w:type="dxa"/>
+              <w:top w:w="80" w:type="dxa"/>
+              <w:bottom w:w="80" w:type="dxa"/>
               <w:left w:w="120" w:type="dxa"/>
               <w:right w:w="120" w:type="dxa"/>
             </w:tcMar>
@@ -294,8 +294,8 @@
             <w:tcW w:type="dxa" w:w="6192"/>
             <w:shd w:fill="F4F8FA"/>
             <w:tcMar>
-              <w:top w:w="85" w:type="dxa"/>
-              <w:bottom w:w="85" w:type="dxa"/>
+              <w:top w:w="80" w:type="dxa"/>
+              <w:bottom w:w="80" w:type="dxa"/>
               <w:left w:w="120" w:type="dxa"/>
               <w:right w:w="120" w:type="dxa"/>
             </w:tcMar>
@@ -320,8 +320,8 @@
             <w:tcW w:type="dxa" w:w="3168"/>
             <w:shd w:fill="FFFFFF"/>
             <w:tcMar>
-              <w:top w:w="85" w:type="dxa"/>
-              <w:bottom w:w="85" w:type="dxa"/>
+              <w:top w:w="80" w:type="dxa"/>
+              <w:bottom w:w="80" w:type="dxa"/>
               <w:left w:w="120" w:type="dxa"/>
               <w:right w:w="120" w:type="dxa"/>
             </w:tcMar>
@@ -344,8 +344,8 @@
             <w:tcW w:type="dxa" w:w="6192"/>
             <w:shd w:fill="FFFFFF"/>
             <w:tcMar>
-              <w:top w:w="85" w:type="dxa"/>
-              <w:bottom w:w="85" w:type="dxa"/>
+              <w:top w:w="80" w:type="dxa"/>
+              <w:bottom w:w="80" w:type="dxa"/>
               <w:left w:w="120" w:type="dxa"/>
               <w:right w:w="120" w:type="dxa"/>
             </w:tcMar>
@@ -359,7 +359,7 @@
                 <w:rFonts w:ascii="Arial" w:hAnsi="Arial"/>
                 <w:sz w:val="18"/>
               </w:rPr>
-              <w:t>Được Campus Router Agent điều hướng khi người học hỏi về điểm số, GPA, xếp loại học lực, cảnh báo học vụ hoặc điều kiện tốt nghiệp.</w:t>
+              <w:t>Tiếp nhận các truy vấn về điểm số, yêu cầu tính GPA học kỳ từ danh sách môn học tự nhập, mô phỏng What-if nâng GPA, cảnh báo học vụ và điều kiện tốt nghiệp.</w:t>
             </w:r>
           </w:p>
         </w:tc>
@@ -370,8 +370,8 @@
             <w:tcW w:type="dxa" w:w="3168"/>
             <w:shd w:fill="F4F8FA"/>
             <w:tcMar>
-              <w:top w:w="85" w:type="dxa"/>
-              <w:bottom w:w="85" w:type="dxa"/>
+              <w:top w:w="80" w:type="dxa"/>
+              <w:bottom w:w="80" w:type="dxa"/>
               <w:left w:w="120" w:type="dxa"/>
               <w:right w:w="120" w:type="dxa"/>
             </w:tcMar>
@@ -394,8 +394,8 @@
             <w:tcW w:type="dxa" w:w="6192"/>
             <w:shd w:fill="F4F8FA"/>
             <w:tcMar>
-              <w:top w:w="85" w:type="dxa"/>
-              <w:bottom w:w="85" w:type="dxa"/>
+              <w:top w:w="80" w:type="dxa"/>
+              <w:bottom w:w="80" w:type="dxa"/>
               <w:left w:w="120" w:type="dxa"/>
               <w:right w:w="120" w:type="dxa"/>
             </w:tcMar>
@@ -409,7 +409,7 @@
                 <w:rFonts w:ascii="Arial" w:hAnsi="Arial"/>
                 <w:sz w:val="18"/>
               </w:rPr>
-              <w:t>Toàn thể sinh viên đại học hệ chính quy HCMUS (Chương trình Chuẩn và Đề án), ưu tiên sinh viên đang trong vùng nguy hiểm học vụ cần tư vấn khẩn.</w:t>
+              <w:t>Toàn thể sinh viên đại học hệ chính quy HCMUS (khoa CNTT, Toán, Hóa, Sinh, Vật lý, Điện tử, Môi trường...).</w:t>
             </w:r>
           </w:p>
         </w:tc>
@@ -445,7 +445,7 @@
           <w:b/>
           <w:sz w:val="20"/>
         </w:rPr>
-        <w:t xml:space="preserve">NGUYÊN TẮC KIẾN TRÚC AN TOÀN (Safety-First Architecture): </w:t>
+        <w:t xml:space="preserve">NGUYÊN TẮC BẢO MẬT &amp; KIẾN TRÚC: </w:t>
       </w:r>
       <w:r>
         <w:rPr>
@@ -453,7 +453,7 @@
           <w:i w:val="0"/>
           <w:sz w:val="20"/>
         </w:rPr>
-        <w:t>GPA Agent không kết nối trực tiếp vào cơ sở dữ liệu điểm cá nhân (SIS) của Trường. Toàn bộ tính toán được thực hiện thông qua mô hình Tự cung cấp điểm số (Student-Provided Data) kết hợp với bộ Calculator toán học chính xác. Đây là kiến trúc an toàn nhất cho prototype cạnh tranh.</w:t>
+        <w:t>GPA Agent vận hành theo cơ chế Tự Cung Cấp Dữ Liệu (Student-Provided Data) kết hợp Bộ Tính Toán Môn Học Chính Xác (Course-Level GPA Calculator). Agent TUYỆT ĐỐI KHÔNG can thiệp hoặc giả mạo kết nối API vào cơ sở dữ liệu SIS/Portal của Nhà trường để đảm bảo an toàn thông tin và quyền riêng tư sinh viên.</w:t>
       </w:r>
     </w:p>
     <w:tbl>
@@ -471,10 +471,10 @@
             <w:tcW w:type="dxa" w:w="8640"/>
             <w:shd w:fill="F0F4F8"/>
             <w:tcMar>
-              <w:top w:w="130" w:type="dxa"/>
-              <w:bottom w:w="130" w:type="dxa"/>
-              <w:left w:w="200" w:type="dxa"/>
-              <w:right w:w="200" w:type="dxa"/>
+              <w:top w:w="120" w:type="dxa"/>
+              <w:bottom w:w="120" w:type="dxa"/>
+              <w:left w:w="180" w:type="dxa"/>
+              <w:right w:w="180" w:type="dxa"/>
             </w:tcMar>
             <w:tcBorders>
               <w:left w:val="single" w:sz="24" w:color="003366"/>
@@ -485,7 +485,7 @@
           </w:tcPr>
           <w:p>
             <w:pPr>
-              <w:spacing w:after="40"/>
+              <w:spacing w:after="40" w:line="276" w:lineRule="auto"/>
             </w:pPr>
             <w:r>
               <w:rPr>
@@ -494,14 +494,14 @@
                 <w:color w:val="003366"/>
                 <w:sz w:val="20"/>
               </w:rPr>
-              <w:t xml:space="preserve">🛡 GUARDRAILS BẮT BUỘC: </w:t>
+              <w:t xml:space="preserve">🛡 GUARDRAILS AN TOÀN BẮT BUỘC: </w:t>
             </w:r>
             <w:r>
               <w:rPr>
                 <w:rFonts w:ascii="Arial" w:hAnsi="Arial"/>
-                <w:sz w:val="20"/>
+                <w:sz w:val="19"/>
               </w:rPr>
-              <w:t>Agent TUYỆT ĐỐI KHÔNG: (1) tự khai thác hoặc giả lập quyền truy cập điểm cá nhân từ Portal; (2) đưa ra kết luận học vụ mang tính pháp lý thay thế quyết định chính thức của Trường; (3) hứa hẹn chắc chắn về kết quả tốt nghiệp mà không yêu cầu kiểm tra đủ điều kiện đầy đủ. Agent luôn nhắc sinh viên đối chiếu với tài khoản Portal cá nhân và xác nhận với Phòng Đào tạo.</w:t>
+              <w:t>Agent TUYỆT ĐỐI KHÔNG: (1) yêu cầu cung cấp mật khẩu Portal; (2) cam đoan kết quả học vụ mang tính pháp lý thay thế thông báo chính thức của Phòng Đào tạo; (3) tính sai các môn bị loại trừ theo Điều 15 (GDQP-AN, GDTC, AV1-4, THCS). Agent luôn nhắc nhở sinh viên đối chiếu với bảng điểm chính thức trên Portal.</w:t>
             </w:r>
           </w:p>
         </w:tc>
@@ -515,132 +515,16 @@
     <w:p>
       <w:pPr>
         <w:keepNext/>
-        <w:spacing w:before="240" w:after="100"/>
+        <w:spacing w:before="360" w:after="160"/>
       </w:pPr>
       <w:r>
         <w:rPr>
           <w:rFonts w:ascii="Arial" w:hAnsi="Arial"/>
           <w:b/>
-          <w:color w:val="1B5E94"/>
-          <w:sz w:val="24"/>
+          <w:color w:val="003366"/>
+          <w:sz w:val="30"/>
         </w:rPr>
-        <w:t>2.1 Cơ chế hoạt động: What-if GPA Simulation Engine</w:t>
-      </w:r>
-    </w:p>
-    <w:p>
-      <w:pPr>
-        <w:spacing w:after="80" w:line="276" w:lineRule="auto"/>
-      </w:pPr>
-      <w:r>
-        <w:rPr>
-          <w:rFonts w:ascii="Arial" w:hAnsi="Arial"/>
-          <w:i w:val="0"/>
-          <w:sz w:val="20"/>
-        </w:rPr>
-        <w:t>Sinh viên cung cấp 4 thông số đầu vào cho bài toán mô phỏng:</w:t>
-      </w:r>
-    </w:p>
-    <w:p>
-      <w:pPr>
-        <w:pStyle w:val="ListBullet"/>
-        <w:spacing w:after="60" w:line="276" w:lineRule="auto"/>
-      </w:pPr>
-      <w:r>
-        <w:rPr>
-          <w:rFonts w:ascii="Arial" w:hAnsi="Arial"/>
-          <w:b/>
-          <w:sz w:val="20"/>
-        </w:rPr>
-        <w:t xml:space="preserve">Input 1: </w:t>
-      </w:r>
-      <w:r>
-        <w:rPr>
-          <w:rFonts w:ascii="Arial" w:hAnsi="Arial"/>
-          <w:sz w:val="20"/>
-        </w:rPr>
-        <w:t>GPA tích lũy hiện tại (thang 10 hoặc thang 4).</w:t>
-      </w:r>
-    </w:p>
-    <w:p>
-      <w:pPr>
-        <w:pStyle w:val="ListBullet"/>
-        <w:spacing w:after="60" w:line="276" w:lineRule="auto"/>
-      </w:pPr>
-      <w:r>
-        <w:rPr>
-          <w:rFonts w:ascii="Arial" w:hAnsi="Arial"/>
-          <w:b/>
-          <w:sz w:val="20"/>
-        </w:rPr>
-        <w:t xml:space="preserve">Input 2: </w:t>
-      </w:r>
-      <w:r>
-        <w:rPr>
-          <w:rFonts w:ascii="Arial" w:hAnsi="Arial"/>
-          <w:sz w:val="20"/>
-        </w:rPr>
-        <w:t>Tổng số tín chỉ tích lũy đã đạt (không kể GDQP, GDTC, Ngoại ngữ tổng quát, Tin học cơ sở).</w:t>
-      </w:r>
-    </w:p>
-    <w:p>
-      <w:pPr>
-        <w:pStyle w:val="ListBullet"/>
-        <w:spacing w:after="60" w:line="276" w:lineRule="auto"/>
-      </w:pPr>
-      <w:r>
-        <w:rPr>
-          <w:rFonts w:ascii="Arial" w:hAnsi="Arial"/>
-          <w:b/>
-          <w:sz w:val="20"/>
-        </w:rPr>
-        <w:t xml:space="preserve">Input 3: </w:t>
-      </w:r>
-      <w:r>
-        <w:rPr>
-          <w:rFonts w:ascii="Arial" w:hAnsi="Arial"/>
-          <w:sz w:val="20"/>
-        </w:rPr>
-        <w:t>Số tín chỉ đăng ký của học kỳ sắp tới.</w:t>
-      </w:r>
-    </w:p>
-    <w:p>
-      <w:pPr>
-        <w:pStyle w:val="ListBullet"/>
-        <w:spacing w:after="60" w:line="276" w:lineRule="auto"/>
-      </w:pPr>
-      <w:r>
-        <w:rPr>
-          <w:rFonts w:ascii="Arial" w:hAnsi="Arial"/>
-          <w:b/>
-          <w:sz w:val="20"/>
-        </w:rPr>
-        <w:t xml:space="preserve">Input 4: </w:t>
-      </w:r>
-      <w:r>
-        <w:rPr>
-          <w:rFonts w:ascii="Arial" w:hAnsi="Arial"/>
-          <w:sz w:val="20"/>
-        </w:rPr>
-        <w:t>Điểm kỳ vọng của từng môn hoặc GPA kỳ vọng của học kỳ sắp tới (thang 10).</w:t>
-      </w:r>
-    </w:p>
-    <w:p>
-      <w:pPr>
-        <w:spacing w:after="80" w:line="276" w:lineRule="auto"/>
-      </w:pPr>
-      <w:r>
-        <w:rPr>
-          <w:rFonts w:ascii="Arial" w:hAnsi="Arial"/>
-          <w:i w:val="0"/>
-          <w:sz w:val="20"/>
-        </w:rPr>
-        <w:t>Agent áp dụng công thức Điều 15 Quy chế Đào tạo (QĐ 1175/QĐ-KHTN) để tính ra:</w:t>
-        <w:br/>
-        <w:t>→ GPA tích lũy mới sau học kỳ.</w:t>
-        <w:br/>
-        <w:t>→ Xếp loại học lực tương ứng.</w:t>
-        <w:br/>
-        <w:t>→ Cảnh báo nếu GPA tiệm cận ngưỡng nguy hiểm.</w:t>
+        <w:t>3. CÁC TÍNH NĂNG TÍNH TOÁN CỐT LÕI (CORE CAPABILITIES)</w:t>
       </w:r>
     </w:p>
     <w:p>
@@ -655,7 +539,168 @@
           <w:color w:val="1B5E94"/>
           <w:sz w:val="24"/>
         </w:rPr>
-        <w:t>2.2 Ví dụ mô phỏng minh họa (Demo Scenario)</w:t>
+        <w:t>3.1 Tính Năng 1: Course-Level Semester GPA Calculator (Tính GPA Học kỳ từ Danh sách Môn học)</w:t>
+      </w:r>
+    </w:p>
+    <w:p>
+      <w:pPr>
+        <w:spacing w:after="80" w:line="276" w:lineRule="auto"/>
+      </w:pPr>
+      <w:r>
+        <w:rPr>
+          <w:rFonts w:ascii="Arial" w:hAnsi="Arial"/>
+          <w:i w:val="0"/>
+          <w:sz w:val="20"/>
+        </w:rPr>
+        <w:t>Sinh viên chỉ cần gửi danh sách môn học, số tín chỉ và điểm đạt được (theo thang 10 hoặc thang chữ). Agent tự động thực hiện quy trình 6 bước:</w:t>
+      </w:r>
+    </w:p>
+    <w:p>
+      <w:pPr>
+        <w:pStyle w:val="ListBullet"/>
+        <w:spacing w:after="60" w:line="276" w:lineRule="auto"/>
+      </w:pPr>
+      <w:r>
+        <w:rPr>
+          <w:rFonts w:ascii="Arial" w:hAnsi="Arial"/>
+          <w:sz w:val="20"/>
+        </w:rPr>
+        <w:t>Bước 1 - Bóc tách dữ liệu: Trích xuất Tên môn, Số tín chỉ (credits), Điểm học phần từ văn bản tự nhiên sinh viên nhập.</w:t>
+      </w:r>
+    </w:p>
+    <w:p>
+      <w:pPr>
+        <w:pStyle w:val="ListBullet"/>
+        <w:spacing w:after="60" w:line="276" w:lineRule="auto"/>
+      </w:pPr>
+      <w:r>
+        <w:rPr>
+          <w:rFonts w:ascii="Arial" w:hAnsi="Arial"/>
+          <w:sz w:val="20"/>
+        </w:rPr>
+        <w:t>Bước 2 - Bộ lọc loại trừ quy chế (Điều 15 Khoản 1c): Tự động phát hiện và loại trừ môn GDQP-AN, GDTC, Ngoại ngữ tổng quát (AV1, AV2, AV3, AV4), Tin học cơ sở khỏi mẫu số tính GPA.</w:t>
+      </w:r>
+    </w:p>
+    <w:p>
+      <w:pPr>
+        <w:pStyle w:val="ListBullet"/>
+        <w:spacing w:after="60" w:line="276" w:lineRule="auto"/>
+      </w:pPr>
+      <w:r>
+        <w:rPr>
+          <w:rFonts w:ascii="Arial" w:hAnsi="Arial"/>
+          <w:sz w:val="20"/>
+        </w:rPr>
+        <w:t>Bước 3 - Quy đổi thang điểm: Chuyển đổi điểm từng môn từ Thang 10 -&gt; Điểm chữ -&gt; Thang 4 theo Điều 11 QĐ 1175.</w:t>
+      </w:r>
+    </w:p>
+    <w:p>
+      <w:pPr>
+        <w:pStyle w:val="ListBullet"/>
+        <w:spacing w:after="60" w:line="276" w:lineRule="auto"/>
+      </w:pPr>
+      <w:r>
+        <w:rPr>
+          <w:rFonts w:ascii="Arial" w:hAnsi="Arial"/>
+          <w:sz w:val="20"/>
+        </w:rPr>
+        <w:t>Bước 4 - Tính GPA song song: Tính SGPA Thang 10 = Σ(Điểm 10 × ni) / Σ ni và SGPA Thang 4 = Σ(Điểm hệ 4 × ni) / Σ ni.</w:t>
+      </w:r>
+    </w:p>
+    <w:p>
+      <w:pPr>
+        <w:pStyle w:val="ListBullet"/>
+        <w:spacing w:after="60" w:line="276" w:lineRule="auto"/>
+      </w:pPr>
+      <w:r>
+        <w:rPr>
+          <w:rFonts w:ascii="Arial" w:hAnsi="Arial"/>
+          <w:sz w:val="20"/>
+        </w:rPr>
+        <w:t>Bước 5 - Xếp loại học lực kỳ: Đối chiếu bảng K2021+ (Xuất sắc &gt;= 9.0/3.6, Giỏi &gt;= 8.0/3.2, Khá &gt;= 7.0/2.8, Trung bình &gt;= 5.0/1.6, Yếu, Kém).</w:t>
+      </w:r>
+    </w:p>
+    <w:p>
+      <w:pPr>
+        <w:pStyle w:val="ListBullet"/>
+        <w:spacing w:after="60" w:line="276" w:lineRule="auto"/>
+      </w:pPr>
+      <w:r>
+        <w:rPr>
+          <w:rFonts w:ascii="Arial" w:hAnsi="Arial"/>
+          <w:sz w:val="20"/>
+        </w:rPr>
+        <w:t>Bước 6 - Kiểm tra học vụ &amp; Học bổng: Cảnh báo nếu TC đạt &lt; 7 hoặc GPA &lt; 3.0; Đánh giá triển vọng học bổng Khuyến khích Học tập (KKHT) nếu đạt loại Khá/Giỏi/Xuất sắc và DRL Tốt.</w:t>
+      </w:r>
+    </w:p>
+    <w:p>
+      <w:pPr>
+        <w:keepNext/>
+        <w:spacing w:before="240" w:after="100"/>
+      </w:pPr>
+      <w:r>
+        <w:rPr>
+          <w:rFonts w:ascii="Arial" w:hAnsi="Arial"/>
+          <w:b/>
+          <w:color w:val="1B5E94"/>
+          <w:sz w:val="24"/>
+        </w:rPr>
+        <w:t>3.2 Ví dụ Minh Họa Tính Năng Nhập Môn Thực Tế</w:t>
+      </w:r>
+    </w:p>
+    <w:p>
+      <w:pPr>
+        <w:spacing w:after="80" w:line="276" w:lineRule="auto"/>
+      </w:pPr>
+      <w:r>
+        <w:rPr>
+          <w:rFonts w:ascii="Arial" w:hAnsi="Arial"/>
+          <w:b/>
+          <w:sz w:val="20"/>
+        </w:rPr>
+        <w:t xml:space="preserve">Yêu cầu của sinh viên: </w:t>
+      </w:r>
+      <w:r>
+        <w:rPr>
+          <w:rFonts w:ascii="Arial" w:hAnsi="Arial"/>
+          <w:i w:val="0"/>
+          <w:sz w:val="20"/>
+        </w:rPr>
+        <w:t>Kịch bản: Sinh viên gửi truy vấn:</w:t>
+      </w:r>
+    </w:p>
+    <w:p>
+      <w:pPr>
+        <w:spacing w:after="80" w:line="276" w:lineRule="auto"/>
+      </w:pPr>
+      <w:r>
+        <w:rPr>
+          <w:rFonts w:ascii="Arial" w:hAnsi="Arial"/>
+          <w:i/>
+          <w:sz w:val="20"/>
+        </w:rPr>
+        <w:t>«Kỳ này em học: Giải tích 1 (4TC) 8.5, ĐSTT (4TC) 7.0, NMLT (4TC) 9.0, Triết học Mác-Lênin (3TC) 8.0, Anh văn 1 (3TC) 8.5, Thể dục 1 (2TC) 9.0. Tính GPA học kỳ giúp em với!»</w:t>
+      </w:r>
+    </w:p>
+    <w:p>
+      <w:pPr>
+        <w:spacing w:after="80" w:line="276" w:lineRule="auto"/>
+      </w:pPr>
+      <w:r>
+        <w:rPr>
+          <w:rFonts w:ascii="Arial" w:hAnsi="Arial"/>
+          <w:b/>
+          <w:sz w:val="20"/>
+        </w:rPr>
+        <w:t xml:space="preserve">Kết quả tính toán chuẩn hóa: </w:t>
+      </w:r>
+      <w:r>
+        <w:rPr>
+          <w:rFonts w:ascii="Arial" w:hAnsi="Arial"/>
+          <w:i w:val="0"/>
+          <w:sz w:val="20"/>
+        </w:rPr>
+        <w:t>Bảng xử lý của Agent:</w:t>
       </w:r>
     </w:p>
     <w:tbl>
@@ -666,19 +711,25 @@
         <w:tblLook w:firstColumn="1" w:firstRow="1" w:lastColumn="0" w:lastRow="0" w:noHBand="0" w:noVBand="1" w:val="04A0"/>
       </w:tblPr>
       <w:tblGrid>
-        <w:gridCol w:w="4320"/>
-        <w:gridCol w:w="4320"/>
+        <w:gridCol w:w="1080"/>
+        <w:gridCol w:w="1080"/>
+        <w:gridCol w:w="1080"/>
+        <w:gridCol w:w="1080"/>
+        <w:gridCol w:w="1080"/>
+        <w:gridCol w:w="1080"/>
+        <w:gridCol w:w="1080"/>
+        <w:gridCol w:w="1080"/>
       </w:tblGrid>
       <w:tr>
         <w:tc>
           <w:tcPr>
-            <w:tcW w:type="dxa" w:w="3600"/>
+            <w:tcW w:type="dxa" w:w="2304"/>
             <w:shd w:fill="003366"/>
             <w:tcMar>
-              <w:top w:w="110" w:type="dxa"/>
-              <w:bottom w:w="110" w:type="dxa"/>
-              <w:left w:w="130" w:type="dxa"/>
-              <w:right w:w="130" w:type="dxa"/>
+              <w:top w:w="100" w:type="dxa"/>
+              <w:bottom w:w="100" w:type="dxa"/>
+              <w:left w:w="120" w:type="dxa"/>
+              <w:right w:w="120" w:type="dxa"/>
             </w:tcMar>
           </w:tcPr>
           <w:p>
@@ -692,19 +743,19 @@
                 <w:color w:val="FFFFFF"/>
                 <w:sz w:val="19"/>
               </w:rPr>
-              <w:t>Thông số</w:t>
+              <w:t>Môn học</w:t>
             </w:r>
           </w:p>
         </w:tc>
         <w:tc>
           <w:tcPr>
-            <w:tcW w:type="dxa" w:w="5760"/>
+            <w:tcW w:type="dxa" w:w="864"/>
             <w:shd w:fill="003366"/>
             <w:tcMar>
-              <w:top w:w="110" w:type="dxa"/>
-              <w:bottom w:w="110" w:type="dxa"/>
-              <w:left w:w="130" w:type="dxa"/>
-              <w:right w:w="130" w:type="dxa"/>
+              <w:top w:w="100" w:type="dxa"/>
+              <w:bottom w:w="100" w:type="dxa"/>
+              <w:left w:w="120" w:type="dxa"/>
+              <w:right w:w="120" w:type="dxa"/>
             </w:tcMar>
           </w:tcPr>
           <w:p>
@@ -718,7 +769,163 @@
                 <w:color w:val="FFFFFF"/>
                 <w:sz w:val="19"/>
               </w:rPr>
-              <w:t>Giá trị nhập</w:t>
+              <w:t>Số TC</w:t>
+            </w:r>
+          </w:p>
+        </w:tc>
+        <w:tc>
+          <w:tcPr>
+            <w:tcW w:type="dxa" w:w="1152"/>
+            <w:shd w:fill="003366"/>
+            <w:tcMar>
+              <w:top w:w="100" w:type="dxa"/>
+              <w:bottom w:w="100" w:type="dxa"/>
+              <w:left w:w="120" w:type="dxa"/>
+              <w:right w:w="120" w:type="dxa"/>
+            </w:tcMar>
+          </w:tcPr>
+          <w:p>
+            <w:pPr>
+              <w:jc w:val="center"/>
+            </w:pPr>
+            <w:r>
+              <w:rPr>
+                <w:rFonts w:ascii="Arial" w:hAnsi="Arial"/>
+                <w:b/>
+                <w:color w:val="FFFFFF"/>
+                <w:sz w:val="19"/>
+              </w:rPr>
+              <w:t>Điểm 10</w:t>
+            </w:r>
+          </w:p>
+        </w:tc>
+        <w:tc>
+          <w:tcPr>
+            <w:tcW w:type="dxa" w:w="1152"/>
+            <w:shd w:fill="003366"/>
+            <w:tcMar>
+              <w:top w:w="100" w:type="dxa"/>
+              <w:bottom w:w="100" w:type="dxa"/>
+              <w:left w:w="120" w:type="dxa"/>
+              <w:right w:w="120" w:type="dxa"/>
+            </w:tcMar>
+          </w:tcPr>
+          <w:p>
+            <w:pPr>
+              <w:jc w:val="center"/>
+            </w:pPr>
+            <w:r>
+              <w:rPr>
+                <w:rFonts w:ascii="Arial" w:hAnsi="Arial"/>
+                <w:b/>
+                <w:color w:val="FFFFFF"/>
+                <w:sz w:val="19"/>
+              </w:rPr>
+              <w:t>Điểm chữ</w:t>
+            </w:r>
+          </w:p>
+        </w:tc>
+        <w:tc>
+          <w:tcPr>
+            <w:tcW w:type="dxa" w:w="1152"/>
+            <w:shd w:fill="003366"/>
+            <w:tcMar>
+              <w:top w:w="100" w:type="dxa"/>
+              <w:bottom w:w="100" w:type="dxa"/>
+              <w:left w:w="120" w:type="dxa"/>
+              <w:right w:w="120" w:type="dxa"/>
+            </w:tcMar>
+          </w:tcPr>
+          <w:p>
+            <w:pPr>
+              <w:jc w:val="center"/>
+            </w:pPr>
+            <w:r>
+              <w:rPr>
+                <w:rFonts w:ascii="Arial" w:hAnsi="Arial"/>
+                <w:b/>
+                <w:color w:val="FFFFFF"/>
+                <w:sz w:val="19"/>
+              </w:rPr>
+              <w:t>Điểm hệ 4</w:t>
+            </w:r>
+          </w:p>
+        </w:tc>
+        <w:tc>
+          <w:tcPr>
+            <w:tcW w:type="dxa" w:w="1728"/>
+            <w:shd w:fill="003366"/>
+            <w:tcMar>
+              <w:top w:w="100" w:type="dxa"/>
+              <w:bottom w:w="100" w:type="dxa"/>
+              <w:left w:w="120" w:type="dxa"/>
+              <w:right w:w="120" w:type="dxa"/>
+            </w:tcMar>
+          </w:tcPr>
+          <w:p>
+            <w:pPr>
+              <w:jc w:val="center"/>
+            </w:pPr>
+            <w:r>
+              <w:rPr>
+                <w:rFonts w:ascii="Arial" w:hAnsi="Arial"/>
+                <w:b/>
+                <w:color w:val="FFFFFF"/>
+                <w:sz w:val="19"/>
+              </w:rPr>
+              <w:t>Tính GPA?</w:t>
+            </w:r>
+          </w:p>
+        </w:tc>
+        <w:tc>
+          <w:tcPr>
+            <w:tcW w:type="dxa" w:w="1584"/>
+            <w:shd w:fill="003366"/>
+            <w:tcMar>
+              <w:top w:w="100" w:type="dxa"/>
+              <w:bottom w:w="100" w:type="dxa"/>
+              <w:left w:w="120" w:type="dxa"/>
+              <w:right w:w="120" w:type="dxa"/>
+            </w:tcMar>
+          </w:tcPr>
+          <w:p>
+            <w:pPr>
+              <w:jc w:val="center"/>
+            </w:pPr>
+            <w:r>
+              <w:rPr>
+                <w:rFonts w:ascii="Arial" w:hAnsi="Arial"/>
+                <w:b/>
+                <w:color w:val="FFFFFF"/>
+                <w:sz w:val="19"/>
+              </w:rPr>
+              <w:t>Điểm × TC (Hệ 10)</w:t>
+            </w:r>
+          </w:p>
+        </w:tc>
+        <w:tc>
+          <w:tcPr>
+            <w:tcW w:type="dxa" w:w="1584"/>
+            <w:shd w:fill="003366"/>
+            <w:tcMar>
+              <w:top w:w="100" w:type="dxa"/>
+              <w:bottom w:w="100" w:type="dxa"/>
+              <w:left w:w="120" w:type="dxa"/>
+              <w:right w:w="120" w:type="dxa"/>
+            </w:tcMar>
+          </w:tcPr>
+          <w:p>
+            <w:pPr>
+              <w:jc w:val="center"/>
+            </w:pPr>
+            <w:r>
+              <w:rPr>
+                <w:rFonts w:ascii="Arial" w:hAnsi="Arial"/>
+                <w:b/>
+                <w:color w:val="FFFFFF"/>
+                <w:sz w:val="19"/>
+              </w:rPr>
+              <w:t>Điểm × TC (Hệ 4)</w:t>
             </w:r>
           </w:p>
         </w:tc>
@@ -726,11 +933,11 @@
       <w:tr>
         <w:tc>
           <w:tcPr>
-            <w:tcW w:type="dxa" w:w="3600"/>
+            <w:tcW w:type="dxa" w:w="2304"/>
             <w:shd w:fill="FFFFFF"/>
             <w:tcMar>
-              <w:top w:w="85" w:type="dxa"/>
-              <w:bottom w:w="85" w:type="dxa"/>
+              <w:top w:w="80" w:type="dxa"/>
+              <w:bottom w:w="80" w:type="dxa"/>
               <w:left w:w="120" w:type="dxa"/>
               <w:right w:w="120" w:type="dxa"/>
             </w:tcMar>
@@ -744,17 +951,17 @@
                 <w:rFonts w:ascii="Arial" w:hAnsi="Arial"/>
                 <w:sz w:val="18"/>
               </w:rPr>
-              <w:t>GPA tích lũy hiện tại</w:t>
+              <w:t>Giải tích 1</w:t>
             </w:r>
           </w:p>
         </w:tc>
         <w:tc>
           <w:tcPr>
-            <w:tcW w:type="dxa" w:w="5760"/>
+            <w:tcW w:type="dxa" w:w="864"/>
             <w:shd w:fill="FFFFFF"/>
             <w:tcMar>
-              <w:top w:w="85" w:type="dxa"/>
-              <w:bottom w:w="85" w:type="dxa"/>
+              <w:top w:w="80" w:type="dxa"/>
+              <w:bottom w:w="80" w:type="dxa"/>
               <w:left w:w="120" w:type="dxa"/>
               <w:right w:w="120" w:type="dxa"/>
             </w:tcMar>
@@ -768,19 +975,17 @@
                 <w:rFonts w:ascii="Arial" w:hAnsi="Arial"/>
                 <w:sz w:val="18"/>
               </w:rPr>
-              <w:t>3.25 / 4.0  (tương đương 8.1 thang 10)</w:t>
+              <w:t>4</w:t>
             </w:r>
           </w:p>
         </w:tc>
-      </w:tr>
-      <w:tr>
         <w:tc>
           <w:tcPr>
-            <w:tcW w:type="dxa" w:w="3600"/>
-            <w:shd w:fill="F4F8FA"/>
+            <w:tcW w:type="dxa" w:w="1152"/>
+            <w:shd w:fill="FFFFFF"/>
             <w:tcMar>
-              <w:top w:w="85" w:type="dxa"/>
-              <w:bottom w:w="85" w:type="dxa"/>
+              <w:top w:w="80" w:type="dxa"/>
+              <w:bottom w:w="80" w:type="dxa"/>
               <w:left w:w="120" w:type="dxa"/>
               <w:right w:w="120" w:type="dxa"/>
             </w:tcMar>
@@ -794,17 +999,17 @@
                 <w:rFonts w:ascii="Arial" w:hAnsi="Arial"/>
                 <w:sz w:val="18"/>
               </w:rPr>
-              <w:t>Tín chỉ tích lũy hiện tại</w:t>
+              <w:t>8.5</w:t>
             </w:r>
           </w:p>
         </w:tc>
         <w:tc>
           <w:tcPr>
-            <w:tcW w:type="dxa" w:w="5760"/>
-            <w:shd w:fill="F4F8FA"/>
+            <w:tcW w:type="dxa" w:w="1152"/>
+            <w:shd w:fill="FFFFFF"/>
             <w:tcMar>
-              <w:top w:w="85" w:type="dxa"/>
-              <w:bottom w:w="85" w:type="dxa"/>
+              <w:top w:w="80" w:type="dxa"/>
+              <w:bottom w:w="80" w:type="dxa"/>
               <w:left w:w="120" w:type="dxa"/>
               <w:right w:w="120" w:type="dxa"/>
             </w:tcMar>
@@ -818,19 +1023,17 @@
                 <w:rFonts w:ascii="Arial" w:hAnsi="Arial"/>
                 <w:sz w:val="18"/>
               </w:rPr>
-              <w:t>65 tín chỉ đã đạt</w:t>
+              <w:t>A</w:t>
             </w:r>
           </w:p>
         </w:tc>
-      </w:tr>
-      <w:tr>
         <w:tc>
           <w:tcPr>
-            <w:tcW w:type="dxa" w:w="3600"/>
+            <w:tcW w:type="dxa" w:w="1152"/>
             <w:shd w:fill="FFFFFF"/>
             <w:tcMar>
-              <w:top w:w="85" w:type="dxa"/>
-              <w:bottom w:w="85" w:type="dxa"/>
+              <w:top w:w="80" w:type="dxa"/>
+              <w:bottom w:w="80" w:type="dxa"/>
               <w:left w:w="120" w:type="dxa"/>
               <w:right w:w="120" w:type="dxa"/>
             </w:tcMar>
@@ -844,17 +1047,17 @@
                 <w:rFonts w:ascii="Arial" w:hAnsi="Arial"/>
                 <w:sz w:val="18"/>
               </w:rPr>
-              <w:t>Tín chỉ đăng ký kỳ tới</w:t>
+              <w:t>3.5</w:t>
             </w:r>
           </w:p>
         </w:tc>
         <w:tc>
           <w:tcPr>
-            <w:tcW w:type="dxa" w:w="5760"/>
+            <w:tcW w:type="dxa" w:w="1728"/>
             <w:shd w:fill="FFFFFF"/>
             <w:tcMar>
-              <w:top w:w="85" w:type="dxa"/>
-              <w:bottom w:w="85" w:type="dxa"/>
+              <w:top w:w="80" w:type="dxa"/>
+              <w:bottom w:w="80" w:type="dxa"/>
               <w:left w:w="120" w:type="dxa"/>
               <w:right w:w="120" w:type="dxa"/>
             </w:tcMar>
@@ -868,19 +1071,17 @@
                 <w:rFonts w:ascii="Arial" w:hAnsi="Arial"/>
                 <w:sz w:val="18"/>
               </w:rPr>
-              <w:t>18 tín chỉ</w:t>
+              <w:t>CÓ</w:t>
             </w:r>
           </w:p>
         </w:tc>
-      </w:tr>
-      <w:tr>
         <w:tc>
           <w:tcPr>
-            <w:tcW w:type="dxa" w:w="3600"/>
-            <w:shd w:fill="F4F8FA"/>
+            <w:tcW w:type="dxa" w:w="1584"/>
+            <w:shd w:fill="FFFFFF"/>
             <w:tcMar>
-              <w:top w:w="85" w:type="dxa"/>
-              <w:bottom w:w="85" w:type="dxa"/>
+              <w:top w:w="80" w:type="dxa"/>
+              <w:bottom w:w="80" w:type="dxa"/>
               <w:left w:w="120" w:type="dxa"/>
               <w:right w:w="120" w:type="dxa"/>
             </w:tcMar>
@@ -894,17 +1095,17 @@
                 <w:rFonts w:ascii="Arial" w:hAnsi="Arial"/>
                 <w:sz w:val="18"/>
               </w:rPr>
-              <w:t>GPA kỳ vọng kỳ tới</w:t>
+              <w:t>34.0</w:t>
             </w:r>
           </w:p>
         </w:tc>
         <w:tc>
           <w:tcPr>
-            <w:tcW w:type="dxa" w:w="5760"/>
-            <w:shd w:fill="F4F8FA"/>
+            <w:tcW w:type="dxa" w:w="1584"/>
+            <w:shd w:fill="FFFFFF"/>
             <w:tcMar>
-              <w:top w:w="85" w:type="dxa"/>
-              <w:bottom w:w="85" w:type="dxa"/>
+              <w:top w:w="80" w:type="dxa"/>
+              <w:bottom w:w="80" w:type="dxa"/>
               <w:left w:w="120" w:type="dxa"/>
               <w:right w:w="120" w:type="dxa"/>
             </w:tcMar>
@@ -918,7 +1119,1171 @@
                 <w:rFonts w:ascii="Arial" w:hAnsi="Arial"/>
                 <w:sz w:val="18"/>
               </w:rPr>
-              <w:t>3.7 / 4.0 (tương đương 8.9 thang 10)</w:t>
+              <w:t>14.0</w:t>
+            </w:r>
+          </w:p>
+        </w:tc>
+      </w:tr>
+      <w:tr>
+        <w:tc>
+          <w:tcPr>
+            <w:tcW w:type="dxa" w:w="2304"/>
+            <w:shd w:fill="F4F8FA"/>
+            <w:tcMar>
+              <w:top w:w="80" w:type="dxa"/>
+              <w:bottom w:w="80" w:type="dxa"/>
+              <w:left w:w="120" w:type="dxa"/>
+              <w:right w:w="120" w:type="dxa"/>
+            </w:tcMar>
+          </w:tcPr>
+          <w:p>
+            <w:pPr>
+              <w:spacing w:after="0" w:line="264" w:lineRule="auto"/>
+            </w:pPr>
+            <w:r>
+              <w:rPr>
+                <w:rFonts w:ascii="Arial" w:hAnsi="Arial"/>
+                <w:sz w:val="18"/>
+              </w:rPr>
+              <w:t>Đại số tuyến tính</w:t>
+            </w:r>
+          </w:p>
+        </w:tc>
+        <w:tc>
+          <w:tcPr>
+            <w:tcW w:type="dxa" w:w="864"/>
+            <w:shd w:fill="F4F8FA"/>
+            <w:tcMar>
+              <w:top w:w="80" w:type="dxa"/>
+              <w:bottom w:w="80" w:type="dxa"/>
+              <w:left w:w="120" w:type="dxa"/>
+              <w:right w:w="120" w:type="dxa"/>
+            </w:tcMar>
+          </w:tcPr>
+          <w:p>
+            <w:pPr>
+              <w:spacing w:after="0" w:line="264" w:lineRule="auto"/>
+            </w:pPr>
+            <w:r>
+              <w:rPr>
+                <w:rFonts w:ascii="Arial" w:hAnsi="Arial"/>
+                <w:sz w:val="18"/>
+              </w:rPr>
+              <w:t>4</w:t>
+            </w:r>
+          </w:p>
+        </w:tc>
+        <w:tc>
+          <w:tcPr>
+            <w:tcW w:type="dxa" w:w="1152"/>
+            <w:shd w:fill="F4F8FA"/>
+            <w:tcMar>
+              <w:top w:w="80" w:type="dxa"/>
+              <w:bottom w:w="80" w:type="dxa"/>
+              <w:left w:w="120" w:type="dxa"/>
+              <w:right w:w="120" w:type="dxa"/>
+            </w:tcMar>
+          </w:tcPr>
+          <w:p>
+            <w:pPr>
+              <w:spacing w:after="0" w:line="264" w:lineRule="auto"/>
+            </w:pPr>
+            <w:r>
+              <w:rPr>
+                <w:rFonts w:ascii="Arial" w:hAnsi="Arial"/>
+                <w:sz w:val="18"/>
+              </w:rPr>
+              <w:t>7.0</w:t>
+            </w:r>
+          </w:p>
+        </w:tc>
+        <w:tc>
+          <w:tcPr>
+            <w:tcW w:type="dxa" w:w="1152"/>
+            <w:shd w:fill="F4F8FA"/>
+            <w:tcMar>
+              <w:top w:w="80" w:type="dxa"/>
+              <w:bottom w:w="80" w:type="dxa"/>
+              <w:left w:w="120" w:type="dxa"/>
+              <w:right w:w="120" w:type="dxa"/>
+            </w:tcMar>
+          </w:tcPr>
+          <w:p>
+            <w:pPr>
+              <w:spacing w:after="0" w:line="264" w:lineRule="auto"/>
+            </w:pPr>
+            <w:r>
+              <w:rPr>
+                <w:rFonts w:ascii="Arial" w:hAnsi="Arial"/>
+                <w:sz w:val="18"/>
+              </w:rPr>
+              <w:t>B</w:t>
+            </w:r>
+          </w:p>
+        </w:tc>
+        <w:tc>
+          <w:tcPr>
+            <w:tcW w:type="dxa" w:w="1152"/>
+            <w:shd w:fill="F4F8FA"/>
+            <w:tcMar>
+              <w:top w:w="80" w:type="dxa"/>
+              <w:bottom w:w="80" w:type="dxa"/>
+              <w:left w:w="120" w:type="dxa"/>
+              <w:right w:w="120" w:type="dxa"/>
+            </w:tcMar>
+          </w:tcPr>
+          <w:p>
+            <w:pPr>
+              <w:spacing w:after="0" w:line="264" w:lineRule="auto"/>
+            </w:pPr>
+            <w:r>
+              <w:rPr>
+                <w:rFonts w:ascii="Arial" w:hAnsi="Arial"/>
+                <w:sz w:val="18"/>
+              </w:rPr>
+              <w:t>2.5</w:t>
+            </w:r>
+          </w:p>
+        </w:tc>
+        <w:tc>
+          <w:tcPr>
+            <w:tcW w:type="dxa" w:w="1728"/>
+            <w:shd w:fill="F4F8FA"/>
+            <w:tcMar>
+              <w:top w:w="80" w:type="dxa"/>
+              <w:bottom w:w="80" w:type="dxa"/>
+              <w:left w:w="120" w:type="dxa"/>
+              <w:right w:w="120" w:type="dxa"/>
+            </w:tcMar>
+          </w:tcPr>
+          <w:p>
+            <w:pPr>
+              <w:spacing w:after="0" w:line="264" w:lineRule="auto"/>
+            </w:pPr>
+            <w:r>
+              <w:rPr>
+                <w:rFonts w:ascii="Arial" w:hAnsi="Arial"/>
+                <w:sz w:val="18"/>
+              </w:rPr>
+              <w:t>CÓ</w:t>
+            </w:r>
+          </w:p>
+        </w:tc>
+        <w:tc>
+          <w:tcPr>
+            <w:tcW w:type="dxa" w:w="1584"/>
+            <w:shd w:fill="F4F8FA"/>
+            <w:tcMar>
+              <w:top w:w="80" w:type="dxa"/>
+              <w:bottom w:w="80" w:type="dxa"/>
+              <w:left w:w="120" w:type="dxa"/>
+              <w:right w:w="120" w:type="dxa"/>
+            </w:tcMar>
+          </w:tcPr>
+          <w:p>
+            <w:pPr>
+              <w:spacing w:after="0" w:line="264" w:lineRule="auto"/>
+            </w:pPr>
+            <w:r>
+              <w:rPr>
+                <w:rFonts w:ascii="Arial" w:hAnsi="Arial"/>
+                <w:sz w:val="18"/>
+              </w:rPr>
+              <w:t>28.0</w:t>
+            </w:r>
+          </w:p>
+        </w:tc>
+        <w:tc>
+          <w:tcPr>
+            <w:tcW w:type="dxa" w:w="1584"/>
+            <w:shd w:fill="F4F8FA"/>
+            <w:tcMar>
+              <w:top w:w="80" w:type="dxa"/>
+              <w:bottom w:w="80" w:type="dxa"/>
+              <w:left w:w="120" w:type="dxa"/>
+              <w:right w:w="120" w:type="dxa"/>
+            </w:tcMar>
+          </w:tcPr>
+          <w:p>
+            <w:pPr>
+              <w:spacing w:after="0" w:line="264" w:lineRule="auto"/>
+            </w:pPr>
+            <w:r>
+              <w:rPr>
+                <w:rFonts w:ascii="Arial" w:hAnsi="Arial"/>
+                <w:sz w:val="18"/>
+              </w:rPr>
+              <w:t>10.0</w:t>
+            </w:r>
+          </w:p>
+        </w:tc>
+      </w:tr>
+      <w:tr>
+        <w:tc>
+          <w:tcPr>
+            <w:tcW w:type="dxa" w:w="2304"/>
+            <w:shd w:fill="FFFFFF"/>
+            <w:tcMar>
+              <w:top w:w="80" w:type="dxa"/>
+              <w:bottom w:w="80" w:type="dxa"/>
+              <w:left w:w="120" w:type="dxa"/>
+              <w:right w:w="120" w:type="dxa"/>
+            </w:tcMar>
+          </w:tcPr>
+          <w:p>
+            <w:pPr>
+              <w:spacing w:after="0" w:line="264" w:lineRule="auto"/>
+            </w:pPr>
+            <w:r>
+              <w:rPr>
+                <w:rFonts w:ascii="Arial" w:hAnsi="Arial"/>
+                <w:sz w:val="18"/>
+              </w:rPr>
+              <w:t>Nhập môn lập trình</w:t>
+            </w:r>
+          </w:p>
+        </w:tc>
+        <w:tc>
+          <w:tcPr>
+            <w:tcW w:type="dxa" w:w="864"/>
+            <w:shd w:fill="FFFFFF"/>
+            <w:tcMar>
+              <w:top w:w="80" w:type="dxa"/>
+              <w:bottom w:w="80" w:type="dxa"/>
+              <w:left w:w="120" w:type="dxa"/>
+              <w:right w:w="120" w:type="dxa"/>
+            </w:tcMar>
+          </w:tcPr>
+          <w:p>
+            <w:pPr>
+              <w:spacing w:after="0" w:line="264" w:lineRule="auto"/>
+            </w:pPr>
+            <w:r>
+              <w:rPr>
+                <w:rFonts w:ascii="Arial" w:hAnsi="Arial"/>
+                <w:sz w:val="18"/>
+              </w:rPr>
+              <w:t>4</w:t>
+            </w:r>
+          </w:p>
+        </w:tc>
+        <w:tc>
+          <w:tcPr>
+            <w:tcW w:type="dxa" w:w="1152"/>
+            <w:shd w:fill="FFFFFF"/>
+            <w:tcMar>
+              <w:top w:w="80" w:type="dxa"/>
+              <w:bottom w:w="80" w:type="dxa"/>
+              <w:left w:w="120" w:type="dxa"/>
+              <w:right w:w="120" w:type="dxa"/>
+            </w:tcMar>
+          </w:tcPr>
+          <w:p>
+            <w:pPr>
+              <w:spacing w:after="0" w:line="264" w:lineRule="auto"/>
+            </w:pPr>
+            <w:r>
+              <w:rPr>
+                <w:rFonts w:ascii="Arial" w:hAnsi="Arial"/>
+                <w:sz w:val="18"/>
+              </w:rPr>
+              <w:t>9.0</w:t>
+            </w:r>
+          </w:p>
+        </w:tc>
+        <w:tc>
+          <w:tcPr>
+            <w:tcW w:type="dxa" w:w="1152"/>
+            <w:shd w:fill="FFFFFF"/>
+            <w:tcMar>
+              <w:top w:w="80" w:type="dxa"/>
+              <w:bottom w:w="80" w:type="dxa"/>
+              <w:left w:w="120" w:type="dxa"/>
+              <w:right w:w="120" w:type="dxa"/>
+            </w:tcMar>
+          </w:tcPr>
+          <w:p>
+            <w:pPr>
+              <w:spacing w:after="0" w:line="264" w:lineRule="auto"/>
+            </w:pPr>
+            <w:r>
+              <w:rPr>
+                <w:rFonts w:ascii="Arial" w:hAnsi="Arial"/>
+                <w:sz w:val="18"/>
+              </w:rPr>
+              <w:t>A+</w:t>
+            </w:r>
+          </w:p>
+        </w:tc>
+        <w:tc>
+          <w:tcPr>
+            <w:tcW w:type="dxa" w:w="1152"/>
+            <w:shd w:fill="FFFFFF"/>
+            <w:tcMar>
+              <w:top w:w="80" w:type="dxa"/>
+              <w:bottom w:w="80" w:type="dxa"/>
+              <w:left w:w="120" w:type="dxa"/>
+              <w:right w:w="120" w:type="dxa"/>
+            </w:tcMar>
+          </w:tcPr>
+          <w:p>
+            <w:pPr>
+              <w:spacing w:after="0" w:line="264" w:lineRule="auto"/>
+            </w:pPr>
+            <w:r>
+              <w:rPr>
+                <w:rFonts w:ascii="Arial" w:hAnsi="Arial"/>
+                <w:sz w:val="18"/>
+              </w:rPr>
+              <w:t>4.0</w:t>
+            </w:r>
+          </w:p>
+        </w:tc>
+        <w:tc>
+          <w:tcPr>
+            <w:tcW w:type="dxa" w:w="1728"/>
+            <w:shd w:fill="FFFFFF"/>
+            <w:tcMar>
+              <w:top w:w="80" w:type="dxa"/>
+              <w:bottom w:w="80" w:type="dxa"/>
+              <w:left w:w="120" w:type="dxa"/>
+              <w:right w:w="120" w:type="dxa"/>
+            </w:tcMar>
+          </w:tcPr>
+          <w:p>
+            <w:pPr>
+              <w:spacing w:after="0" w:line="264" w:lineRule="auto"/>
+            </w:pPr>
+            <w:r>
+              <w:rPr>
+                <w:rFonts w:ascii="Arial" w:hAnsi="Arial"/>
+                <w:sz w:val="18"/>
+              </w:rPr>
+              <w:t>CÓ</w:t>
+            </w:r>
+          </w:p>
+        </w:tc>
+        <w:tc>
+          <w:tcPr>
+            <w:tcW w:type="dxa" w:w="1584"/>
+            <w:shd w:fill="FFFFFF"/>
+            <w:tcMar>
+              <w:top w:w="80" w:type="dxa"/>
+              <w:bottom w:w="80" w:type="dxa"/>
+              <w:left w:w="120" w:type="dxa"/>
+              <w:right w:w="120" w:type="dxa"/>
+            </w:tcMar>
+          </w:tcPr>
+          <w:p>
+            <w:pPr>
+              <w:spacing w:after="0" w:line="264" w:lineRule="auto"/>
+            </w:pPr>
+            <w:r>
+              <w:rPr>
+                <w:rFonts w:ascii="Arial" w:hAnsi="Arial"/>
+                <w:sz w:val="18"/>
+              </w:rPr>
+              <w:t>36.0</w:t>
+            </w:r>
+          </w:p>
+        </w:tc>
+        <w:tc>
+          <w:tcPr>
+            <w:tcW w:type="dxa" w:w="1584"/>
+            <w:shd w:fill="FFFFFF"/>
+            <w:tcMar>
+              <w:top w:w="80" w:type="dxa"/>
+              <w:bottom w:w="80" w:type="dxa"/>
+              <w:left w:w="120" w:type="dxa"/>
+              <w:right w:w="120" w:type="dxa"/>
+            </w:tcMar>
+          </w:tcPr>
+          <w:p>
+            <w:pPr>
+              <w:spacing w:after="0" w:line="264" w:lineRule="auto"/>
+            </w:pPr>
+            <w:r>
+              <w:rPr>
+                <w:rFonts w:ascii="Arial" w:hAnsi="Arial"/>
+                <w:sz w:val="18"/>
+              </w:rPr>
+              <w:t>16.0</w:t>
+            </w:r>
+          </w:p>
+        </w:tc>
+      </w:tr>
+      <w:tr>
+        <w:tc>
+          <w:tcPr>
+            <w:tcW w:type="dxa" w:w="2304"/>
+            <w:shd w:fill="F4F8FA"/>
+            <w:tcMar>
+              <w:top w:w="80" w:type="dxa"/>
+              <w:bottom w:w="80" w:type="dxa"/>
+              <w:left w:w="120" w:type="dxa"/>
+              <w:right w:w="120" w:type="dxa"/>
+            </w:tcMar>
+          </w:tcPr>
+          <w:p>
+            <w:pPr>
+              <w:spacing w:after="0" w:line="264" w:lineRule="auto"/>
+            </w:pPr>
+            <w:r>
+              <w:rPr>
+                <w:rFonts w:ascii="Arial" w:hAnsi="Arial"/>
+                <w:sz w:val="18"/>
+              </w:rPr>
+              <w:t>Triết học Mác-Lênin</w:t>
+            </w:r>
+          </w:p>
+        </w:tc>
+        <w:tc>
+          <w:tcPr>
+            <w:tcW w:type="dxa" w:w="864"/>
+            <w:shd w:fill="F4F8FA"/>
+            <w:tcMar>
+              <w:top w:w="80" w:type="dxa"/>
+              <w:bottom w:w="80" w:type="dxa"/>
+              <w:left w:w="120" w:type="dxa"/>
+              <w:right w:w="120" w:type="dxa"/>
+            </w:tcMar>
+          </w:tcPr>
+          <w:p>
+            <w:pPr>
+              <w:spacing w:after="0" w:line="264" w:lineRule="auto"/>
+            </w:pPr>
+            <w:r>
+              <w:rPr>
+                <w:rFonts w:ascii="Arial" w:hAnsi="Arial"/>
+                <w:sz w:val="18"/>
+              </w:rPr>
+              <w:t>3</w:t>
+            </w:r>
+          </w:p>
+        </w:tc>
+        <w:tc>
+          <w:tcPr>
+            <w:tcW w:type="dxa" w:w="1152"/>
+            <w:shd w:fill="F4F8FA"/>
+            <w:tcMar>
+              <w:top w:w="80" w:type="dxa"/>
+              <w:bottom w:w="80" w:type="dxa"/>
+              <w:left w:w="120" w:type="dxa"/>
+              <w:right w:w="120" w:type="dxa"/>
+            </w:tcMar>
+          </w:tcPr>
+          <w:p>
+            <w:pPr>
+              <w:spacing w:after="0" w:line="264" w:lineRule="auto"/>
+            </w:pPr>
+            <w:r>
+              <w:rPr>
+                <w:rFonts w:ascii="Arial" w:hAnsi="Arial"/>
+                <w:sz w:val="18"/>
+              </w:rPr>
+              <w:t>8.0</w:t>
+            </w:r>
+          </w:p>
+        </w:tc>
+        <w:tc>
+          <w:tcPr>
+            <w:tcW w:type="dxa" w:w="1152"/>
+            <w:shd w:fill="F4F8FA"/>
+            <w:tcMar>
+              <w:top w:w="80" w:type="dxa"/>
+              <w:bottom w:w="80" w:type="dxa"/>
+              <w:left w:w="120" w:type="dxa"/>
+              <w:right w:w="120" w:type="dxa"/>
+            </w:tcMar>
+          </w:tcPr>
+          <w:p>
+            <w:pPr>
+              <w:spacing w:after="0" w:line="264" w:lineRule="auto"/>
+            </w:pPr>
+            <w:r>
+              <w:rPr>
+                <w:rFonts w:ascii="Arial" w:hAnsi="Arial"/>
+                <w:sz w:val="18"/>
+              </w:rPr>
+              <w:t>B+</w:t>
+            </w:r>
+          </w:p>
+        </w:tc>
+        <w:tc>
+          <w:tcPr>
+            <w:tcW w:type="dxa" w:w="1152"/>
+            <w:shd w:fill="F4F8FA"/>
+            <w:tcMar>
+              <w:top w:w="80" w:type="dxa"/>
+              <w:bottom w:w="80" w:type="dxa"/>
+              <w:left w:w="120" w:type="dxa"/>
+              <w:right w:w="120" w:type="dxa"/>
+            </w:tcMar>
+          </w:tcPr>
+          <w:p>
+            <w:pPr>
+              <w:spacing w:after="0" w:line="264" w:lineRule="auto"/>
+            </w:pPr>
+            <w:r>
+              <w:rPr>
+                <w:rFonts w:ascii="Arial" w:hAnsi="Arial"/>
+                <w:sz w:val="18"/>
+              </w:rPr>
+              <w:t>3.0</w:t>
+            </w:r>
+          </w:p>
+        </w:tc>
+        <w:tc>
+          <w:tcPr>
+            <w:tcW w:type="dxa" w:w="1728"/>
+            <w:shd w:fill="F4F8FA"/>
+            <w:tcMar>
+              <w:top w:w="80" w:type="dxa"/>
+              <w:bottom w:w="80" w:type="dxa"/>
+              <w:left w:w="120" w:type="dxa"/>
+              <w:right w:w="120" w:type="dxa"/>
+            </w:tcMar>
+          </w:tcPr>
+          <w:p>
+            <w:pPr>
+              <w:spacing w:after="0" w:line="264" w:lineRule="auto"/>
+            </w:pPr>
+            <w:r>
+              <w:rPr>
+                <w:rFonts w:ascii="Arial" w:hAnsi="Arial"/>
+                <w:sz w:val="18"/>
+              </w:rPr>
+              <w:t>CÓ</w:t>
+            </w:r>
+          </w:p>
+        </w:tc>
+        <w:tc>
+          <w:tcPr>
+            <w:tcW w:type="dxa" w:w="1584"/>
+            <w:shd w:fill="F4F8FA"/>
+            <w:tcMar>
+              <w:top w:w="80" w:type="dxa"/>
+              <w:bottom w:w="80" w:type="dxa"/>
+              <w:left w:w="120" w:type="dxa"/>
+              <w:right w:w="120" w:type="dxa"/>
+            </w:tcMar>
+          </w:tcPr>
+          <w:p>
+            <w:pPr>
+              <w:spacing w:after="0" w:line="264" w:lineRule="auto"/>
+            </w:pPr>
+            <w:r>
+              <w:rPr>
+                <w:rFonts w:ascii="Arial" w:hAnsi="Arial"/>
+                <w:sz w:val="18"/>
+              </w:rPr>
+              <w:t>24.0</w:t>
+            </w:r>
+          </w:p>
+        </w:tc>
+        <w:tc>
+          <w:tcPr>
+            <w:tcW w:type="dxa" w:w="1584"/>
+            <w:shd w:fill="F4F8FA"/>
+            <w:tcMar>
+              <w:top w:w="80" w:type="dxa"/>
+              <w:bottom w:w="80" w:type="dxa"/>
+              <w:left w:w="120" w:type="dxa"/>
+              <w:right w:w="120" w:type="dxa"/>
+            </w:tcMar>
+          </w:tcPr>
+          <w:p>
+            <w:pPr>
+              <w:spacing w:after="0" w:line="264" w:lineRule="auto"/>
+            </w:pPr>
+            <w:r>
+              <w:rPr>
+                <w:rFonts w:ascii="Arial" w:hAnsi="Arial"/>
+                <w:sz w:val="18"/>
+              </w:rPr>
+              <w:t>9.0</w:t>
+            </w:r>
+          </w:p>
+        </w:tc>
+      </w:tr>
+      <w:tr>
+        <w:tc>
+          <w:tcPr>
+            <w:tcW w:type="dxa" w:w="2304"/>
+            <w:shd w:fill="FFFFFF"/>
+            <w:tcMar>
+              <w:top w:w="80" w:type="dxa"/>
+              <w:bottom w:w="80" w:type="dxa"/>
+              <w:left w:w="120" w:type="dxa"/>
+              <w:right w:w="120" w:type="dxa"/>
+            </w:tcMar>
+          </w:tcPr>
+          <w:p>
+            <w:pPr>
+              <w:spacing w:after="0" w:line="264" w:lineRule="auto"/>
+            </w:pPr>
+            <w:r>
+              <w:rPr>
+                <w:rFonts w:ascii="Arial" w:hAnsi="Arial"/>
+                <w:sz w:val="18"/>
+              </w:rPr>
+              <w:t>Anh văn 1</w:t>
+            </w:r>
+          </w:p>
+        </w:tc>
+        <w:tc>
+          <w:tcPr>
+            <w:tcW w:type="dxa" w:w="864"/>
+            <w:shd w:fill="FFFFFF"/>
+            <w:tcMar>
+              <w:top w:w="80" w:type="dxa"/>
+              <w:bottom w:w="80" w:type="dxa"/>
+              <w:left w:w="120" w:type="dxa"/>
+              <w:right w:w="120" w:type="dxa"/>
+            </w:tcMar>
+          </w:tcPr>
+          <w:p>
+            <w:pPr>
+              <w:spacing w:after="0" w:line="264" w:lineRule="auto"/>
+            </w:pPr>
+            <w:r>
+              <w:rPr>
+                <w:rFonts w:ascii="Arial" w:hAnsi="Arial"/>
+                <w:sz w:val="18"/>
+              </w:rPr>
+              <w:t>3</w:t>
+            </w:r>
+          </w:p>
+        </w:tc>
+        <w:tc>
+          <w:tcPr>
+            <w:tcW w:type="dxa" w:w="1152"/>
+            <w:shd w:fill="FFFFFF"/>
+            <w:tcMar>
+              <w:top w:w="80" w:type="dxa"/>
+              <w:bottom w:w="80" w:type="dxa"/>
+              <w:left w:w="120" w:type="dxa"/>
+              <w:right w:w="120" w:type="dxa"/>
+            </w:tcMar>
+          </w:tcPr>
+          <w:p>
+            <w:pPr>
+              <w:spacing w:after="0" w:line="264" w:lineRule="auto"/>
+            </w:pPr>
+            <w:r>
+              <w:rPr>
+                <w:rFonts w:ascii="Arial" w:hAnsi="Arial"/>
+                <w:sz w:val="18"/>
+              </w:rPr>
+              <w:t>8.5</w:t>
+            </w:r>
+          </w:p>
+        </w:tc>
+        <w:tc>
+          <w:tcPr>
+            <w:tcW w:type="dxa" w:w="1152"/>
+            <w:shd w:fill="FFFFFF"/>
+            <w:tcMar>
+              <w:top w:w="80" w:type="dxa"/>
+              <w:bottom w:w="80" w:type="dxa"/>
+              <w:left w:w="120" w:type="dxa"/>
+              <w:right w:w="120" w:type="dxa"/>
+            </w:tcMar>
+          </w:tcPr>
+          <w:p>
+            <w:pPr>
+              <w:spacing w:after="0" w:line="264" w:lineRule="auto"/>
+            </w:pPr>
+            <w:r>
+              <w:rPr>
+                <w:rFonts w:ascii="Arial" w:hAnsi="Arial"/>
+                <w:sz w:val="18"/>
+              </w:rPr>
+              <w:t>A</w:t>
+            </w:r>
+          </w:p>
+        </w:tc>
+        <w:tc>
+          <w:tcPr>
+            <w:tcW w:type="dxa" w:w="1152"/>
+            <w:shd w:fill="FFFFFF"/>
+            <w:tcMar>
+              <w:top w:w="80" w:type="dxa"/>
+              <w:bottom w:w="80" w:type="dxa"/>
+              <w:left w:w="120" w:type="dxa"/>
+              <w:right w:w="120" w:type="dxa"/>
+            </w:tcMar>
+          </w:tcPr>
+          <w:p>
+            <w:pPr>
+              <w:spacing w:after="0" w:line="264" w:lineRule="auto"/>
+            </w:pPr>
+            <w:r>
+              <w:rPr>
+                <w:rFonts w:ascii="Arial" w:hAnsi="Arial"/>
+                <w:sz w:val="18"/>
+              </w:rPr>
+              <w:t>3.5</w:t>
+            </w:r>
+          </w:p>
+        </w:tc>
+        <w:tc>
+          <w:tcPr>
+            <w:tcW w:type="dxa" w:w="1728"/>
+            <w:shd w:fill="FFFFFF"/>
+            <w:tcMar>
+              <w:top w:w="80" w:type="dxa"/>
+              <w:bottom w:w="80" w:type="dxa"/>
+              <w:left w:w="120" w:type="dxa"/>
+              <w:right w:w="120" w:type="dxa"/>
+            </w:tcMar>
+          </w:tcPr>
+          <w:p>
+            <w:pPr>
+              <w:spacing w:after="0" w:line="264" w:lineRule="auto"/>
+            </w:pPr>
+            <w:r>
+              <w:rPr>
+                <w:rFonts w:ascii="Arial" w:hAnsi="Arial"/>
+                <w:sz w:val="18"/>
+              </w:rPr>
+              <w:t>KHÔNG (Điều 15)</w:t>
+            </w:r>
+          </w:p>
+        </w:tc>
+        <w:tc>
+          <w:tcPr>
+            <w:tcW w:type="dxa" w:w="1584"/>
+            <w:shd w:fill="FFFFFF"/>
+            <w:tcMar>
+              <w:top w:w="80" w:type="dxa"/>
+              <w:bottom w:w="80" w:type="dxa"/>
+              <w:left w:w="120" w:type="dxa"/>
+              <w:right w:w="120" w:type="dxa"/>
+            </w:tcMar>
+          </w:tcPr>
+          <w:p>
+            <w:pPr>
+              <w:spacing w:after="0" w:line="264" w:lineRule="auto"/>
+            </w:pPr>
+            <w:r>
+              <w:rPr>
+                <w:rFonts w:ascii="Arial" w:hAnsi="Arial"/>
+                <w:sz w:val="18"/>
+              </w:rPr>
+              <w:t>—</w:t>
+            </w:r>
+          </w:p>
+        </w:tc>
+        <w:tc>
+          <w:tcPr>
+            <w:tcW w:type="dxa" w:w="1584"/>
+            <w:shd w:fill="FFFFFF"/>
+            <w:tcMar>
+              <w:top w:w="80" w:type="dxa"/>
+              <w:bottom w:w="80" w:type="dxa"/>
+              <w:left w:w="120" w:type="dxa"/>
+              <w:right w:w="120" w:type="dxa"/>
+            </w:tcMar>
+          </w:tcPr>
+          <w:p>
+            <w:pPr>
+              <w:spacing w:after="0" w:line="264" w:lineRule="auto"/>
+            </w:pPr>
+            <w:r>
+              <w:rPr>
+                <w:rFonts w:ascii="Arial" w:hAnsi="Arial"/>
+                <w:sz w:val="18"/>
+              </w:rPr>
+              <w:t>—</w:t>
+            </w:r>
+          </w:p>
+        </w:tc>
+      </w:tr>
+      <w:tr>
+        <w:tc>
+          <w:tcPr>
+            <w:tcW w:type="dxa" w:w="2304"/>
+            <w:shd w:fill="F4F8FA"/>
+            <w:tcMar>
+              <w:top w:w="80" w:type="dxa"/>
+              <w:bottom w:w="80" w:type="dxa"/>
+              <w:left w:w="120" w:type="dxa"/>
+              <w:right w:w="120" w:type="dxa"/>
+            </w:tcMar>
+          </w:tcPr>
+          <w:p>
+            <w:pPr>
+              <w:spacing w:after="0" w:line="264" w:lineRule="auto"/>
+            </w:pPr>
+            <w:r>
+              <w:rPr>
+                <w:rFonts w:ascii="Arial" w:hAnsi="Arial"/>
+                <w:sz w:val="18"/>
+              </w:rPr>
+              <w:t>Giáo dục thể chất 1</w:t>
+            </w:r>
+          </w:p>
+        </w:tc>
+        <w:tc>
+          <w:tcPr>
+            <w:tcW w:type="dxa" w:w="864"/>
+            <w:shd w:fill="F4F8FA"/>
+            <w:tcMar>
+              <w:top w:w="80" w:type="dxa"/>
+              <w:bottom w:w="80" w:type="dxa"/>
+              <w:left w:w="120" w:type="dxa"/>
+              <w:right w:w="120" w:type="dxa"/>
+            </w:tcMar>
+          </w:tcPr>
+          <w:p>
+            <w:pPr>
+              <w:spacing w:after="0" w:line="264" w:lineRule="auto"/>
+            </w:pPr>
+            <w:r>
+              <w:rPr>
+                <w:rFonts w:ascii="Arial" w:hAnsi="Arial"/>
+                <w:sz w:val="18"/>
+              </w:rPr>
+              <w:t>2</w:t>
+            </w:r>
+          </w:p>
+        </w:tc>
+        <w:tc>
+          <w:tcPr>
+            <w:tcW w:type="dxa" w:w="1152"/>
+            <w:shd w:fill="F4F8FA"/>
+            <w:tcMar>
+              <w:top w:w="80" w:type="dxa"/>
+              <w:bottom w:w="80" w:type="dxa"/>
+              <w:left w:w="120" w:type="dxa"/>
+              <w:right w:w="120" w:type="dxa"/>
+            </w:tcMar>
+          </w:tcPr>
+          <w:p>
+            <w:pPr>
+              <w:spacing w:after="0" w:line="264" w:lineRule="auto"/>
+            </w:pPr>
+            <w:r>
+              <w:rPr>
+                <w:rFonts w:ascii="Arial" w:hAnsi="Arial"/>
+                <w:sz w:val="18"/>
+              </w:rPr>
+              <w:t>9.0</w:t>
+            </w:r>
+          </w:p>
+        </w:tc>
+        <w:tc>
+          <w:tcPr>
+            <w:tcW w:type="dxa" w:w="1152"/>
+            <w:shd w:fill="F4F8FA"/>
+            <w:tcMar>
+              <w:top w:w="80" w:type="dxa"/>
+              <w:bottom w:w="80" w:type="dxa"/>
+              <w:left w:w="120" w:type="dxa"/>
+              <w:right w:w="120" w:type="dxa"/>
+            </w:tcMar>
+          </w:tcPr>
+          <w:p>
+            <w:pPr>
+              <w:spacing w:after="0" w:line="264" w:lineRule="auto"/>
+            </w:pPr>
+            <w:r>
+              <w:rPr>
+                <w:rFonts w:ascii="Arial" w:hAnsi="Arial"/>
+                <w:sz w:val="18"/>
+              </w:rPr>
+              <w:t>A+</w:t>
+            </w:r>
+          </w:p>
+        </w:tc>
+        <w:tc>
+          <w:tcPr>
+            <w:tcW w:type="dxa" w:w="1152"/>
+            <w:shd w:fill="F4F8FA"/>
+            <w:tcMar>
+              <w:top w:w="80" w:type="dxa"/>
+              <w:bottom w:w="80" w:type="dxa"/>
+              <w:left w:w="120" w:type="dxa"/>
+              <w:right w:w="120" w:type="dxa"/>
+            </w:tcMar>
+          </w:tcPr>
+          <w:p>
+            <w:pPr>
+              <w:spacing w:after="0" w:line="264" w:lineRule="auto"/>
+            </w:pPr>
+            <w:r>
+              <w:rPr>
+                <w:rFonts w:ascii="Arial" w:hAnsi="Arial"/>
+                <w:sz w:val="18"/>
+              </w:rPr>
+              <w:t>4.0</w:t>
+            </w:r>
+          </w:p>
+        </w:tc>
+        <w:tc>
+          <w:tcPr>
+            <w:tcW w:type="dxa" w:w="1728"/>
+            <w:shd w:fill="F4F8FA"/>
+            <w:tcMar>
+              <w:top w:w="80" w:type="dxa"/>
+              <w:bottom w:w="80" w:type="dxa"/>
+              <w:left w:w="120" w:type="dxa"/>
+              <w:right w:w="120" w:type="dxa"/>
+            </w:tcMar>
+          </w:tcPr>
+          <w:p>
+            <w:pPr>
+              <w:spacing w:after="0" w:line="264" w:lineRule="auto"/>
+            </w:pPr>
+            <w:r>
+              <w:rPr>
+                <w:rFonts w:ascii="Arial" w:hAnsi="Arial"/>
+                <w:sz w:val="18"/>
+              </w:rPr>
+              <w:t>KHÔNG (Điều 15)</w:t>
+            </w:r>
+          </w:p>
+        </w:tc>
+        <w:tc>
+          <w:tcPr>
+            <w:tcW w:type="dxa" w:w="1584"/>
+            <w:shd w:fill="F4F8FA"/>
+            <w:tcMar>
+              <w:top w:w="80" w:type="dxa"/>
+              <w:bottom w:w="80" w:type="dxa"/>
+              <w:left w:w="120" w:type="dxa"/>
+              <w:right w:w="120" w:type="dxa"/>
+            </w:tcMar>
+          </w:tcPr>
+          <w:p>
+            <w:pPr>
+              <w:spacing w:after="0" w:line="264" w:lineRule="auto"/>
+            </w:pPr>
+            <w:r>
+              <w:rPr>
+                <w:rFonts w:ascii="Arial" w:hAnsi="Arial"/>
+                <w:sz w:val="18"/>
+              </w:rPr>
+              <w:t>—</w:t>
+            </w:r>
+          </w:p>
+        </w:tc>
+        <w:tc>
+          <w:tcPr>
+            <w:tcW w:type="dxa" w:w="1584"/>
+            <w:shd w:fill="F4F8FA"/>
+            <w:tcMar>
+              <w:top w:w="80" w:type="dxa"/>
+              <w:bottom w:w="80" w:type="dxa"/>
+              <w:left w:w="120" w:type="dxa"/>
+              <w:right w:w="120" w:type="dxa"/>
+            </w:tcMar>
+          </w:tcPr>
+          <w:p>
+            <w:pPr>
+              <w:spacing w:after="0" w:line="264" w:lineRule="auto"/>
+            </w:pPr>
+            <w:r>
+              <w:rPr>
+                <w:rFonts w:ascii="Arial" w:hAnsi="Arial"/>
+                <w:sz w:val="18"/>
+              </w:rPr>
+              <w:t>—</w:t>
+            </w:r>
+          </w:p>
+        </w:tc>
+      </w:tr>
+      <w:tr>
+        <w:tc>
+          <w:tcPr>
+            <w:tcW w:type="dxa" w:w="2304"/>
+            <w:shd w:fill="FFFFFF"/>
+            <w:tcMar>
+              <w:top w:w="80" w:type="dxa"/>
+              <w:bottom w:w="80" w:type="dxa"/>
+              <w:left w:w="120" w:type="dxa"/>
+              <w:right w:w="120" w:type="dxa"/>
+            </w:tcMar>
+          </w:tcPr>
+          <w:p>
+            <w:pPr>
+              <w:spacing w:after="0" w:line="264" w:lineRule="auto"/>
+            </w:pPr>
+            <w:r>
+              <w:rPr>
+                <w:rFonts w:ascii="Arial" w:hAnsi="Arial"/>
+                <w:sz w:val="18"/>
+              </w:rPr>
+              <w:t>TỔNG CỘNG TÍNH GPA</w:t>
+            </w:r>
+          </w:p>
+        </w:tc>
+        <w:tc>
+          <w:tcPr>
+            <w:tcW w:type="dxa" w:w="864"/>
+            <w:shd w:fill="FFFFFF"/>
+            <w:tcMar>
+              <w:top w:w="80" w:type="dxa"/>
+              <w:bottom w:w="80" w:type="dxa"/>
+              <w:left w:w="120" w:type="dxa"/>
+              <w:right w:w="120" w:type="dxa"/>
+            </w:tcMar>
+          </w:tcPr>
+          <w:p>
+            <w:pPr>
+              <w:spacing w:after="0" w:line="264" w:lineRule="auto"/>
+            </w:pPr>
+            <w:r>
+              <w:rPr>
+                <w:rFonts w:ascii="Arial" w:hAnsi="Arial"/>
+                <w:sz w:val="18"/>
+              </w:rPr>
+              <w:t>15 TC</w:t>
+            </w:r>
+          </w:p>
+        </w:tc>
+        <w:tc>
+          <w:tcPr>
+            <w:tcW w:type="dxa" w:w="1152"/>
+            <w:shd w:fill="FFFFFF"/>
+            <w:tcMar>
+              <w:top w:w="80" w:type="dxa"/>
+              <w:bottom w:w="80" w:type="dxa"/>
+              <w:left w:w="120" w:type="dxa"/>
+              <w:right w:w="120" w:type="dxa"/>
+            </w:tcMar>
+          </w:tcPr>
+          <w:p>
+            <w:pPr>
+              <w:spacing w:after="0" w:line="264" w:lineRule="auto"/>
+            </w:pPr>
+            <w:r>
+              <w:rPr>
+                <w:rFonts w:ascii="Arial" w:hAnsi="Arial"/>
+                <w:sz w:val="18"/>
+              </w:rPr>
+              <w:t>—</w:t>
+            </w:r>
+          </w:p>
+        </w:tc>
+        <w:tc>
+          <w:tcPr>
+            <w:tcW w:type="dxa" w:w="1152"/>
+            <w:shd w:fill="FFFFFF"/>
+            <w:tcMar>
+              <w:top w:w="80" w:type="dxa"/>
+              <w:bottom w:w="80" w:type="dxa"/>
+              <w:left w:w="120" w:type="dxa"/>
+              <w:right w:w="120" w:type="dxa"/>
+            </w:tcMar>
+          </w:tcPr>
+          <w:p>
+            <w:pPr>
+              <w:spacing w:after="0" w:line="264" w:lineRule="auto"/>
+            </w:pPr>
+            <w:r>
+              <w:rPr>
+                <w:rFonts w:ascii="Arial" w:hAnsi="Arial"/>
+                <w:sz w:val="18"/>
+              </w:rPr>
+              <w:t>—</w:t>
+            </w:r>
+          </w:p>
+        </w:tc>
+        <w:tc>
+          <w:tcPr>
+            <w:tcW w:type="dxa" w:w="1152"/>
+            <w:shd w:fill="FFFFFF"/>
+            <w:tcMar>
+              <w:top w:w="80" w:type="dxa"/>
+              <w:bottom w:w="80" w:type="dxa"/>
+              <w:left w:w="120" w:type="dxa"/>
+              <w:right w:w="120" w:type="dxa"/>
+            </w:tcMar>
+          </w:tcPr>
+          <w:p>
+            <w:pPr>
+              <w:spacing w:after="0" w:line="264" w:lineRule="auto"/>
+            </w:pPr>
+            <w:r>
+              <w:rPr>
+                <w:rFonts w:ascii="Arial" w:hAnsi="Arial"/>
+                <w:sz w:val="18"/>
+              </w:rPr>
+              <w:t>—</w:t>
+            </w:r>
+          </w:p>
+        </w:tc>
+        <w:tc>
+          <w:tcPr>
+            <w:tcW w:type="dxa" w:w="1728"/>
+            <w:shd w:fill="FFFFFF"/>
+            <w:tcMar>
+              <w:top w:w="80" w:type="dxa"/>
+              <w:bottom w:w="80" w:type="dxa"/>
+              <w:left w:w="120" w:type="dxa"/>
+              <w:right w:w="120" w:type="dxa"/>
+            </w:tcMar>
+          </w:tcPr>
+          <w:p>
+            <w:pPr>
+              <w:spacing w:after="0" w:line="264" w:lineRule="auto"/>
+            </w:pPr>
+            <w:r>
+              <w:rPr>
+                <w:rFonts w:ascii="Arial" w:hAnsi="Arial"/>
+                <w:sz w:val="18"/>
+              </w:rPr>
+              <w:t>—</w:t>
+            </w:r>
+          </w:p>
+        </w:tc>
+        <w:tc>
+          <w:tcPr>
+            <w:tcW w:type="dxa" w:w="1584"/>
+            <w:shd w:fill="FFFFFF"/>
+            <w:tcMar>
+              <w:top w:w="80" w:type="dxa"/>
+              <w:bottom w:w="80" w:type="dxa"/>
+              <w:left w:w="120" w:type="dxa"/>
+              <w:right w:w="120" w:type="dxa"/>
+            </w:tcMar>
+          </w:tcPr>
+          <w:p>
+            <w:pPr>
+              <w:spacing w:after="0" w:line="264" w:lineRule="auto"/>
+            </w:pPr>
+            <w:r>
+              <w:rPr>
+                <w:rFonts w:ascii="Arial" w:hAnsi="Arial"/>
+                <w:sz w:val="18"/>
+              </w:rPr>
+              <w:t>122.0</w:t>
+            </w:r>
+          </w:p>
+        </w:tc>
+        <w:tc>
+          <w:tcPr>
+            <w:tcW w:type="dxa" w:w="1584"/>
+            <w:shd w:fill="FFFFFF"/>
+            <w:tcMar>
+              <w:top w:w="80" w:type="dxa"/>
+              <w:bottom w:w="80" w:type="dxa"/>
+              <w:left w:w="120" w:type="dxa"/>
+              <w:right w:w="120" w:type="dxa"/>
+            </w:tcMar>
+          </w:tcPr>
+          <w:p>
+            <w:pPr>
+              <w:spacing w:after="0" w:line="264" w:lineRule="auto"/>
+            </w:pPr>
+            <w:r>
+              <w:rPr>
+                <w:rFonts w:ascii="Arial" w:hAnsi="Arial"/>
+                <w:sz w:val="18"/>
+              </w:rPr>
+              <w:t>49.0</w:t>
             </w:r>
           </w:p>
         </w:tc>
@@ -939,7 +2304,7 @@
           <w:i w:val="0"/>
           <w:sz w:val="20"/>
         </w:rPr>
-        <w:t>→ GPA tích lũy sau học kỳ = (3.25 × 65 + 3.7 × 18) / (65 + 18) = (211.25 + 66.6) / 83 = 277.85 / 83 ≈ 3.35 / 4.0</w:t>
+        <w:t>• Tổng tín chỉ tính GPA: 4 + 4 + 4 + 3 = 15 tín chỉ (đã loại 3 TC Anh văn 1 và 2 TC Thể dục 1).</w:t>
       </w:r>
     </w:p>
     <w:p>
@@ -952,7 +2317,7 @@
           <w:i w:val="0"/>
           <w:sz w:val="20"/>
         </w:rPr>
-        <w:t>→ Xếp loại học lực: GIỎI (3.20 – 3.59 / 4.0 tương đương 8.0 – 8.9 thang 10 theo K2021+)</w:t>
+        <w:t>• GPA học kỳ Thang 10: 122.0 / 15 = 8.13 / 10.0.</w:t>
       </w:r>
     </w:p>
     <w:p>
@@ -965,7 +2330,74 @@
           <w:i w:val="0"/>
           <w:sz w:val="20"/>
         </w:rPr>
-        <w:t>→ Khoảng cách đến Xuất sắc: Cần đạt GPA tích lũy ≥ 3.60 / 4.0 (thiếu 0.25 điểm)</w:t>
+        <w:t>• GPA học kỳ Thang 4: 49.0 / 15 = 3.27 / 4.0.</w:t>
+      </w:r>
+    </w:p>
+    <w:p>
+      <w:pPr>
+        <w:spacing w:after="80" w:line="276" w:lineRule="auto"/>
+      </w:pPr>
+      <w:r>
+        <w:rPr>
+          <w:rFonts w:ascii="Arial" w:hAnsi="Arial"/>
+          <w:i w:val="0"/>
+          <w:sz w:val="20"/>
+        </w:rPr>
+        <w:t>• Xếp loại học lực học kỳ: GIỎI (Áp dụng khóa K2021+).</w:t>
+      </w:r>
+    </w:p>
+    <w:p>
+      <w:pPr>
+        <w:spacing w:after="80" w:line="276" w:lineRule="auto"/>
+      </w:pPr>
+      <w:r>
+        <w:rPr>
+          <w:rFonts w:ascii="Arial" w:hAnsi="Arial"/>
+          <w:i w:val="0"/>
+          <w:sz w:val="20"/>
+        </w:rPr>
+        <w:t>• Tình trạng học vụ: An toàn tuyệt đối (Đạt 15 TC &gt; 7 TC, GPA 8.13 &gt; 3.0).</w:t>
+      </w:r>
+    </w:p>
+    <w:p>
+      <w:pPr>
+        <w:spacing w:after="80" w:line="276" w:lineRule="auto"/>
+      </w:pPr>
+      <w:r>
+        <w:rPr>
+          <w:rFonts w:ascii="Arial" w:hAnsi="Arial"/>
+          <w:i w:val="0"/>
+          <w:sz w:val="20"/>
+        </w:rPr>
+        <w:t>• Cơ hội Học bổng KKHT: ĐỦ ĐIỀU KIỆN VỀ ĐIỂM HỌC TẬP để xét Học bổng loại Giỏi (nếu Điểm rèn luyện kỳ này đạt loại Tốt &gt;= 80 điểm trở lên và không nợ học phí).</w:t>
+      </w:r>
+    </w:p>
+    <w:p>
+      <w:pPr>
+        <w:keepNext/>
+        <w:spacing w:before="240" w:after="100"/>
+      </w:pPr>
+      <w:r>
+        <w:rPr>
+          <w:rFonts w:ascii="Arial" w:hAnsi="Arial"/>
+          <w:b/>
+          <w:color w:val="1B5E94"/>
+          <w:sz w:val="24"/>
+        </w:rPr>
+        <w:t>3.3 Tính Năng 2: What-if Simulation Engine (Mô Phỏng GPA Tích Lũy)</w:t>
+      </w:r>
+    </w:p>
+    <w:p>
+      <w:pPr>
+        <w:spacing w:after="80" w:line="276" w:lineRule="auto"/>
+      </w:pPr>
+      <w:r>
+        <w:rPr>
+          <w:rFonts w:ascii="Arial" w:hAnsi="Arial"/>
+          <w:i w:val="0"/>
+          <w:sz w:val="20"/>
+        </w:rPr>
+        <w:t>Nhận 4 tham số: CGPA hiện tại, Tổng TC đã đạt, TC kỳ tới, Điểm kỳ vọng -&gt; Tính toán CGPA mới và xác định điểm môn học tối thiểu cần đạt để nâng hạng học lực hoặc thoát cảnh báo.</w:t>
       </w:r>
     </w:p>
     <w:p>
@@ -980,7 +2412,7 @@
           <w:color w:val="003366"/>
           <w:sz w:val="30"/>
         </w:rPr>
-        <w:t>3. PHONG CÁCH GIAO TIẾP &amp; BỘ NGUYÊN TẮC PHẢN HỒI</w:t>
+        <w:t>4. PHONG CÁCH GIAO TIẾP &amp; BỘ NGUYÊN TẮC PHẢN HỒI</w:t>
       </w:r>
     </w:p>
     <w:p>
@@ -994,14 +2426,14 @@
           <w:b/>
           <w:sz w:val="20"/>
         </w:rPr>
-        <w:t xml:space="preserve">Giọng điệu: </w:t>
+        <w:t xml:space="preserve">Tính minh bạch: </w:t>
       </w:r>
       <w:r>
         <w:rPr>
           <w:rFonts w:ascii="Arial" w:hAnsi="Arial"/>
           <w:sz w:val="20"/>
         </w:rPr>
-        <w:t>Chủ động, cụ thể, luôn kèm con số tính toán minh bạch để sinh viên kiểm chứng.</w:t>
+        <w:t>Minh bạch tuyệt đối: Luôn trình bày công thức, chỉ rõ môn nào được tính, môn nào bị loại trừ theo quy chế, kèm bảng chi tiết từng môn.</w:t>
       </w:r>
     </w:p>
     <w:p>
@@ -1022,7 +2454,7 @@
           <w:rFonts w:ascii="Arial" w:hAnsi="Arial"/>
           <w:sz w:val="20"/>
         </w:rPr>
-        <w:t>Khi xác nhận cảnh báo học vụ, Agent dùng tông ân cần nhưng rõ ràng; không gây hoảng loạn nhưng cũng không che giấu mức độ nghiêm trọng.</w:t>
+        <w:t>Chủ động kiểm tra rủi ro: Bất kể khi nào tính GPA kỳ, luôn tự động kiểm tra số tín chỉ đạt (&lt; 7 TC) và GPA kỳ (&lt; 3.0) để cảnh báo học vụ sớm cho sinh viên.</w:t>
       </w:r>
     </w:p>
     <w:p>
@@ -1036,667 +2468,15 @@
           <w:b/>
           <w:sz w:val="20"/>
         </w:rPr>
-        <w:t xml:space="preserve">Chuẩn hóa phản hồi: </w:t>
+        <w:t xml:space="preserve">Hỗ trợ phát triển: </w:t>
       </w:r>
       <w:r>
         <w:rPr>
           <w:rFonts w:ascii="Arial" w:hAnsi="Arial"/>
           <w:sz w:val="20"/>
         </w:rPr>
-        <w:t>Mỗi câu trả lời tính toán đều phải hiển thị rõ: [Công thức áp dụng] → [Dữ liệu nhập] → [Kết quả] → [Diễn giải xếp loại] → [Hành động đề xuất tiếp theo].</w:t>
+        <w:t>Khích lệ và hướng dẫn cụ thể: Nếu sinh viên đạt điểm cao, tự động nhắc nhở cơ hội học bổng KKHT kèm điều kiện DRL cần đạt.</w:t>
       </w:r>
-    </w:p>
-    <w:p>
-      <w:pPr>
-        <w:pStyle w:val="ListBullet"/>
-        <w:spacing w:after="60" w:line="276" w:lineRule="auto"/>
-      </w:pPr>
-      <w:r>
-        <w:rPr>
-          <w:rFonts w:ascii="Arial" w:hAnsi="Arial"/>
-          <w:b/>
-          <w:sz w:val="20"/>
-        </w:rPr>
-        <w:t xml:space="preserve">Toàn vẹn thông tin: </w:t>
-      </w:r>
-      <w:r>
-        <w:rPr>
-          <w:rFonts w:ascii="Arial" w:hAnsi="Arial"/>
-          <w:sz w:val="20"/>
-        </w:rPr>
-        <w:t>Khi sinh viên hỏi về điều kiện tốt nghiệp, luôn liệt kê đầy đủ 5 điều kiện bắt buộc (TC, GDQP, GDTC, Ngoại ngữ, Tin học) thay vì chỉ trả lời một phần.</w:t>
-      </w:r>
-    </w:p>
-    <w:p>
-      <w:pPr>
-        <w:keepNext/>
-        <w:spacing w:before="360" w:after="160"/>
-      </w:pPr>
-      <w:r>
-        <w:rPr>
-          <w:rFonts w:ascii="Arial" w:hAnsi="Arial"/>
-          <w:b/>
-          <w:color w:val="003366"/>
-          <w:sz w:val="30"/>
-        </w:rPr>
-        <w:t>4. NĂNG LỰC TƯƠNG TÁC &amp; PHẠM VI TRI THỨC</w:t>
-      </w:r>
-    </w:p>
-    <w:tbl>
-      <w:tblPr>
-        <w:tblStyle w:val="TableGrid"/>
-        <w:tblW w:type="auto" w:w="0"/>
-        <w:jc w:val="center"/>
-        <w:tblLook w:firstColumn="1" w:firstRow="1" w:lastColumn="0" w:lastRow="0" w:noHBand="0" w:noVBand="1" w:val="04A0"/>
-      </w:tblPr>
-      <w:tblGrid>
-        <w:gridCol w:w="2880"/>
-        <w:gridCol w:w="2880"/>
-        <w:gridCol w:w="2880"/>
-      </w:tblGrid>
-      <w:tr>
-        <w:tc>
-          <w:tcPr>
-            <w:tcW w:type="dxa" w:w="2304"/>
-            <w:shd w:fill="003366"/>
-            <w:tcMar>
-              <w:top w:w="110" w:type="dxa"/>
-              <w:bottom w:w="110" w:type="dxa"/>
-              <w:left w:w="130" w:type="dxa"/>
-              <w:right w:w="130" w:type="dxa"/>
-            </w:tcMar>
-          </w:tcPr>
-          <w:p>
-            <w:pPr>
-              <w:jc w:val="center"/>
-            </w:pPr>
-            <w:r>
-              <w:rPr>
-                <w:rFonts w:ascii="Arial" w:hAnsi="Arial"/>
-                <w:b/>
-                <w:color w:val="FFFFFF"/>
-                <w:sz w:val="19"/>
-              </w:rPr>
-              <w:t>Nhóm chức năng</w:t>
-            </w:r>
-          </w:p>
-        </w:tc>
-        <w:tc>
-          <w:tcPr>
-            <w:tcW w:type="dxa" w:w="4608"/>
-            <w:shd w:fill="003366"/>
-            <w:tcMar>
-              <w:top w:w="110" w:type="dxa"/>
-              <w:bottom w:w="110" w:type="dxa"/>
-              <w:left w:w="130" w:type="dxa"/>
-              <w:right w:w="130" w:type="dxa"/>
-            </w:tcMar>
-          </w:tcPr>
-          <w:p>
-            <w:pPr>
-              <w:jc w:val="center"/>
-            </w:pPr>
-            <w:r>
-              <w:rPr>
-                <w:rFonts w:ascii="Arial" w:hAnsi="Arial"/>
-                <w:b/>
-                <w:color w:val="FFFFFF"/>
-                <w:sz w:val="19"/>
-              </w:rPr>
-              <w:t>Khả năng cụ thể</w:t>
-            </w:r>
-          </w:p>
-        </w:tc>
-        <w:tc>
-          <w:tcPr>
-            <w:tcW w:type="dxa" w:w="2448"/>
-            <w:shd w:fill="003366"/>
-            <w:tcMar>
-              <w:top w:w="110" w:type="dxa"/>
-              <w:bottom w:w="110" w:type="dxa"/>
-              <w:left w:w="130" w:type="dxa"/>
-              <w:right w:w="130" w:type="dxa"/>
-            </w:tcMar>
-          </w:tcPr>
-          <w:p>
-            <w:pPr>
-              <w:jc w:val="center"/>
-            </w:pPr>
-            <w:r>
-              <w:rPr>
-                <w:rFonts w:ascii="Arial" w:hAnsi="Arial"/>
-                <w:b/>
-                <w:color w:val="FFFFFF"/>
-                <w:sz w:val="19"/>
-              </w:rPr>
-              <w:t>Văn bản căn cứ</w:t>
-            </w:r>
-          </w:p>
-        </w:tc>
-      </w:tr>
-      <w:tr>
-        <w:tc>
-          <w:tcPr>
-            <w:tcW w:type="dxa" w:w="2304"/>
-            <w:shd w:fill="FFFFFF"/>
-            <w:tcMar>
-              <w:top w:w="85" w:type="dxa"/>
-              <w:bottom w:w="85" w:type="dxa"/>
-              <w:left w:w="120" w:type="dxa"/>
-              <w:right w:w="120" w:type="dxa"/>
-            </w:tcMar>
-          </w:tcPr>
-          <w:p>
-            <w:pPr>
-              <w:spacing w:after="0" w:line="264" w:lineRule="auto"/>
-            </w:pPr>
-            <w:r>
-              <w:rPr>
-                <w:rFonts w:ascii="Arial" w:hAnsi="Arial"/>
-                <w:sz w:val="18"/>
-              </w:rPr>
-              <w:t>Tính điểm học phần</w:t>
-            </w:r>
-          </w:p>
-        </w:tc>
-        <w:tc>
-          <w:tcPr>
-            <w:tcW w:type="dxa" w:w="4608"/>
-            <w:shd w:fill="FFFFFF"/>
-            <w:tcMar>
-              <w:top w:w="85" w:type="dxa"/>
-              <w:bottom w:w="85" w:type="dxa"/>
-              <w:left w:w="120" w:type="dxa"/>
-              <w:right w:w="120" w:type="dxa"/>
-            </w:tcMar>
-          </w:tcPr>
-          <w:p>
-            <w:pPr>
-              <w:spacing w:after="0" w:line="264" w:lineRule="auto"/>
-            </w:pPr>
-            <w:r>
-              <w:rPr>
-                <w:rFonts w:ascii="Arial" w:hAnsi="Arial"/>
-                <w:sz w:val="18"/>
-              </w:rPr>
-              <w:t>Giải thích công thức tính điểm tổng kết từ các thành phần (quá trình + cuối kỳ), quy đổi thang 10 → thang 4 → chữ</w:t>
-            </w:r>
-          </w:p>
-        </w:tc>
-        <w:tc>
-          <w:tcPr>
-            <w:tcW w:type="dxa" w:w="2448"/>
-            <w:shd w:fill="FFFFFF"/>
-            <w:tcMar>
-              <w:top w:w="85" w:type="dxa"/>
-              <w:bottom w:w="85" w:type="dxa"/>
-              <w:left w:w="120" w:type="dxa"/>
-              <w:right w:w="120" w:type="dxa"/>
-            </w:tcMar>
-          </w:tcPr>
-          <w:p>
-            <w:pPr>
-              <w:spacing w:after="0" w:line="264" w:lineRule="auto"/>
-            </w:pPr>
-            <w:r>
-              <w:rPr>
-                <w:rFonts w:ascii="Arial" w:hAnsi="Arial"/>
-                <w:sz w:val="18"/>
-              </w:rPr>
-              <w:t>Điều 11 QĐ 1175</w:t>
-            </w:r>
-          </w:p>
-        </w:tc>
-      </w:tr>
-      <w:tr>
-        <w:tc>
-          <w:tcPr>
-            <w:tcW w:type="dxa" w:w="2304"/>
-            <w:shd w:fill="F4F8FA"/>
-            <w:tcMar>
-              <w:top w:w="85" w:type="dxa"/>
-              <w:bottom w:w="85" w:type="dxa"/>
-              <w:left w:w="120" w:type="dxa"/>
-              <w:right w:w="120" w:type="dxa"/>
-            </w:tcMar>
-          </w:tcPr>
-          <w:p>
-            <w:pPr>
-              <w:spacing w:after="0" w:line="264" w:lineRule="auto"/>
-            </w:pPr>
-            <w:r>
-              <w:rPr>
-                <w:rFonts w:ascii="Arial" w:hAnsi="Arial"/>
-                <w:sz w:val="18"/>
-              </w:rPr>
-              <w:t>Tính GPA học kỳ &amp; tích lũy</w:t>
-            </w:r>
-          </w:p>
-        </w:tc>
-        <w:tc>
-          <w:tcPr>
-            <w:tcW w:type="dxa" w:w="4608"/>
-            <w:shd w:fill="F4F8FA"/>
-            <w:tcMar>
-              <w:top w:w="85" w:type="dxa"/>
-              <w:bottom w:w="85" w:type="dxa"/>
-              <w:left w:w="120" w:type="dxa"/>
-              <w:right w:w="120" w:type="dxa"/>
-            </w:tcMar>
-          </w:tcPr>
-          <w:p>
-            <w:pPr>
-              <w:spacing w:after="0" w:line="264" w:lineRule="auto"/>
-            </w:pPr>
-            <w:r>
-              <w:rPr>
-                <w:rFonts w:ascii="Arial" w:hAnsi="Arial"/>
-                <w:sz w:val="18"/>
-              </w:rPr>
-              <w:t>Thực hiện What-if simulation với điểm số do SV tự cung cấp</w:t>
-            </w:r>
-          </w:p>
-        </w:tc>
-        <w:tc>
-          <w:tcPr>
-            <w:tcW w:type="dxa" w:w="2448"/>
-            <w:shd w:fill="F4F8FA"/>
-            <w:tcMar>
-              <w:top w:w="85" w:type="dxa"/>
-              <w:bottom w:w="85" w:type="dxa"/>
-              <w:left w:w="120" w:type="dxa"/>
-              <w:right w:w="120" w:type="dxa"/>
-            </w:tcMar>
-          </w:tcPr>
-          <w:p>
-            <w:pPr>
-              <w:spacing w:after="0" w:line="264" w:lineRule="auto"/>
-            </w:pPr>
-            <w:r>
-              <w:rPr>
-                <w:rFonts w:ascii="Arial" w:hAnsi="Arial"/>
-                <w:sz w:val="18"/>
-              </w:rPr>
-              <w:t>Điều 15 QĐ 1175</w:t>
-            </w:r>
-          </w:p>
-        </w:tc>
-      </w:tr>
-      <w:tr>
-        <w:tc>
-          <w:tcPr>
-            <w:tcW w:type="dxa" w:w="2304"/>
-            <w:shd w:fill="FFFFFF"/>
-            <w:tcMar>
-              <w:top w:w="85" w:type="dxa"/>
-              <w:bottom w:w="85" w:type="dxa"/>
-              <w:left w:w="120" w:type="dxa"/>
-              <w:right w:w="120" w:type="dxa"/>
-            </w:tcMar>
-          </w:tcPr>
-          <w:p>
-            <w:pPr>
-              <w:spacing w:after="0" w:line="264" w:lineRule="auto"/>
-            </w:pPr>
-            <w:r>
-              <w:rPr>
-                <w:rFonts w:ascii="Arial" w:hAnsi="Arial"/>
-                <w:sz w:val="18"/>
-              </w:rPr>
-              <w:t>Xếp loại học lực</w:t>
-            </w:r>
-          </w:p>
-        </w:tc>
-        <w:tc>
-          <w:tcPr>
-            <w:tcW w:type="dxa" w:w="4608"/>
-            <w:shd w:fill="FFFFFF"/>
-            <w:tcMar>
-              <w:top w:w="85" w:type="dxa"/>
-              <w:bottom w:w="85" w:type="dxa"/>
-              <w:left w:w="120" w:type="dxa"/>
-              <w:right w:w="120" w:type="dxa"/>
-            </w:tcMar>
-          </w:tcPr>
-          <w:p>
-            <w:pPr>
-              <w:spacing w:after="0" w:line="264" w:lineRule="auto"/>
-            </w:pPr>
-            <w:r>
-              <w:rPr>
-                <w:rFonts w:ascii="Arial" w:hAnsi="Arial"/>
-                <w:sz w:val="18"/>
-              </w:rPr>
-              <w:t>Phân loại theo khóa K2021+ và K2020-; phân biệt điểm trung bình và điểm trung bình tích lũy</w:t>
-            </w:r>
-          </w:p>
-        </w:tc>
-        <w:tc>
-          <w:tcPr>
-            <w:tcW w:type="dxa" w:w="2448"/>
-            <w:shd w:fill="FFFFFF"/>
-            <w:tcMar>
-              <w:top w:w="85" w:type="dxa"/>
-              <w:bottom w:w="85" w:type="dxa"/>
-              <w:left w:w="120" w:type="dxa"/>
-              <w:right w:w="120" w:type="dxa"/>
-            </w:tcMar>
-          </w:tcPr>
-          <w:p>
-            <w:pPr>
-              <w:spacing w:after="0" w:line="264" w:lineRule="auto"/>
-            </w:pPr>
-            <w:r>
-              <w:rPr>
-                <w:rFonts w:ascii="Arial" w:hAnsi="Arial"/>
-                <w:sz w:val="18"/>
-              </w:rPr>
-              <w:t>Điều 15 QĐ 1175</w:t>
-            </w:r>
-          </w:p>
-        </w:tc>
-      </w:tr>
-      <w:tr>
-        <w:tc>
-          <w:tcPr>
-            <w:tcW w:type="dxa" w:w="2304"/>
-            <w:shd w:fill="F4F8FA"/>
-            <w:tcMar>
-              <w:top w:w="85" w:type="dxa"/>
-              <w:bottom w:w="85" w:type="dxa"/>
-              <w:left w:w="120" w:type="dxa"/>
-              <w:right w:w="120" w:type="dxa"/>
-            </w:tcMar>
-          </w:tcPr>
-          <w:p>
-            <w:pPr>
-              <w:spacing w:after="0" w:line="264" w:lineRule="auto"/>
-            </w:pPr>
-            <w:r>
-              <w:rPr>
-                <w:rFonts w:ascii="Arial" w:hAnsi="Arial"/>
-                <w:sz w:val="18"/>
-              </w:rPr>
-              <w:t>Cảnh báo học vụ</w:t>
-            </w:r>
-          </w:p>
-        </w:tc>
-        <w:tc>
-          <w:tcPr>
-            <w:tcW w:type="dxa" w:w="4608"/>
-            <w:shd w:fill="F4F8FA"/>
-            <w:tcMar>
-              <w:top w:w="85" w:type="dxa"/>
-              <w:bottom w:w="85" w:type="dxa"/>
-              <w:left w:w="120" w:type="dxa"/>
-              <w:right w:w="120" w:type="dxa"/>
-            </w:tcMar>
-          </w:tcPr>
-          <w:p>
-            <w:pPr>
-              <w:spacing w:after="0" w:line="264" w:lineRule="auto"/>
-            </w:pPr>
-            <w:r>
-              <w:rPr>
-                <w:rFonts w:ascii="Arial" w:hAnsi="Arial"/>
-                <w:sz w:val="18"/>
-              </w:rPr>
-              <w:t>Cảnh báo nguy cơ cảnh báo lần 1, lần 2, lần 3 (buộc thôi học); mô phỏng kịch bản thoát nguy</w:t>
-            </w:r>
-          </w:p>
-        </w:tc>
-        <w:tc>
-          <w:tcPr>
-            <w:tcW w:type="dxa" w:w="2448"/>
-            <w:shd w:fill="F4F8FA"/>
-            <w:tcMar>
-              <w:top w:w="85" w:type="dxa"/>
-              <w:bottom w:w="85" w:type="dxa"/>
-              <w:left w:w="120" w:type="dxa"/>
-              <w:right w:w="120" w:type="dxa"/>
-            </w:tcMar>
-          </w:tcPr>
-          <w:p>
-            <w:pPr>
-              <w:spacing w:after="0" w:line="264" w:lineRule="auto"/>
-            </w:pPr>
-            <w:r>
-              <w:rPr>
-                <w:rFonts w:ascii="Arial" w:hAnsi="Arial"/>
-                <w:sz w:val="18"/>
-              </w:rPr>
-              <w:t>Điều 16 QĐ 1175</w:t>
-            </w:r>
-          </w:p>
-        </w:tc>
-      </w:tr>
-      <w:tr>
-        <w:tc>
-          <w:tcPr>
-            <w:tcW w:type="dxa" w:w="2304"/>
-            <w:shd w:fill="FFFFFF"/>
-            <w:tcMar>
-              <w:top w:w="85" w:type="dxa"/>
-              <w:bottom w:w="85" w:type="dxa"/>
-              <w:left w:w="120" w:type="dxa"/>
-              <w:right w:w="120" w:type="dxa"/>
-            </w:tcMar>
-          </w:tcPr>
-          <w:p>
-            <w:pPr>
-              <w:spacing w:after="0" w:line="264" w:lineRule="auto"/>
-            </w:pPr>
-            <w:r>
-              <w:rPr>
-                <w:rFonts w:ascii="Arial" w:hAnsi="Arial"/>
-                <w:sz w:val="18"/>
-              </w:rPr>
-              <w:t>Điều kiện tốt nghiệp</w:t>
-            </w:r>
-          </w:p>
-        </w:tc>
-        <w:tc>
-          <w:tcPr>
-            <w:tcW w:type="dxa" w:w="4608"/>
-            <w:shd w:fill="FFFFFF"/>
-            <w:tcMar>
-              <w:top w:w="85" w:type="dxa"/>
-              <w:bottom w:w="85" w:type="dxa"/>
-              <w:left w:w="120" w:type="dxa"/>
-              <w:right w:w="120" w:type="dxa"/>
-            </w:tcMar>
-          </w:tcPr>
-          <w:p>
-            <w:pPr>
-              <w:spacing w:after="0" w:line="264" w:lineRule="auto"/>
-            </w:pPr>
-            <w:r>
-              <w:rPr>
-                <w:rFonts w:ascii="Arial" w:hAnsi="Arial"/>
-                <w:sz w:val="18"/>
-              </w:rPr>
-              <w:t>Kiểm tra 5 điều kiện: TC + GDQP + GDTC + Ngoại ngữ + Tin học; hạng tốt nghiệp</w:t>
-            </w:r>
-          </w:p>
-        </w:tc>
-        <w:tc>
-          <w:tcPr>
-            <w:tcW w:type="dxa" w:w="2448"/>
-            <w:shd w:fill="FFFFFF"/>
-            <w:tcMar>
-              <w:top w:w="85" w:type="dxa"/>
-              <w:bottom w:w="85" w:type="dxa"/>
-              <w:left w:w="120" w:type="dxa"/>
-              <w:right w:w="120" w:type="dxa"/>
-            </w:tcMar>
-          </w:tcPr>
-          <w:p>
-            <w:pPr>
-              <w:spacing w:after="0" w:line="264" w:lineRule="auto"/>
-            </w:pPr>
-            <w:r>
-              <w:rPr>
-                <w:rFonts w:ascii="Arial" w:hAnsi="Arial"/>
-                <w:sz w:val="18"/>
-              </w:rPr>
-              <w:t>Điều 17 QĐ 1175</w:t>
-            </w:r>
-          </w:p>
-        </w:tc>
-      </w:tr>
-      <w:tr>
-        <w:tc>
-          <w:tcPr>
-            <w:tcW w:type="dxa" w:w="2304"/>
-            <w:shd w:fill="F4F8FA"/>
-            <w:tcMar>
-              <w:top w:w="85" w:type="dxa"/>
-              <w:bottom w:w="85" w:type="dxa"/>
-              <w:left w:w="120" w:type="dxa"/>
-              <w:right w:w="120" w:type="dxa"/>
-            </w:tcMar>
-          </w:tcPr>
-          <w:p>
-            <w:pPr>
-              <w:spacing w:after="0" w:line="264" w:lineRule="auto"/>
-            </w:pPr>
-            <w:r>
-              <w:rPr>
-                <w:rFonts w:ascii="Arial" w:hAnsi="Arial"/>
-                <w:sz w:val="18"/>
-              </w:rPr>
-              <w:t>Điểm rèn luyện</w:t>
-            </w:r>
-          </w:p>
-        </w:tc>
-        <w:tc>
-          <w:tcPr>
-            <w:tcW w:type="dxa" w:w="4608"/>
-            <w:shd w:fill="F4F8FA"/>
-            <w:tcMar>
-              <w:top w:w="85" w:type="dxa"/>
-              <w:bottom w:w="85" w:type="dxa"/>
-              <w:left w:w="120" w:type="dxa"/>
-              <w:right w:w="120" w:type="dxa"/>
-            </w:tcMar>
-          </w:tcPr>
-          <w:p>
-            <w:pPr>
-              <w:spacing w:after="0" w:line="264" w:lineRule="auto"/>
-            </w:pPr>
-            <w:r>
-              <w:rPr>
-                <w:rFonts w:ascii="Arial" w:hAnsi="Arial"/>
-                <w:sz w:val="18"/>
-              </w:rPr>
-              <w:t>Giải thích thang 100 điểm, 5 tiêu chí, 13 chỉ số, mức phân loại Xuất sắc đến Kém</w:t>
-            </w:r>
-          </w:p>
-        </w:tc>
-        <w:tc>
-          <w:tcPr>
-            <w:tcW w:type="dxa" w:w="2448"/>
-            <w:shd w:fill="F4F8FA"/>
-            <w:tcMar>
-              <w:top w:w="85" w:type="dxa"/>
-              <w:bottom w:w="85" w:type="dxa"/>
-              <w:left w:w="120" w:type="dxa"/>
-              <w:right w:w="120" w:type="dxa"/>
-            </w:tcMar>
-          </w:tcPr>
-          <w:p>
-            <w:pPr>
-              <w:spacing w:after="0" w:line="264" w:lineRule="auto"/>
-            </w:pPr>
-            <w:r>
-              <w:rPr>
-                <w:rFonts w:ascii="Arial" w:hAnsi="Arial"/>
-                <w:sz w:val="18"/>
-              </w:rPr>
-              <w:t>Quy chế DRL HCMUS</w:t>
-            </w:r>
-          </w:p>
-        </w:tc>
-      </w:tr>
-      <w:tr>
-        <w:tc>
-          <w:tcPr>
-            <w:tcW w:type="dxa" w:w="2304"/>
-            <w:shd w:fill="FFFFFF"/>
-            <w:tcMar>
-              <w:top w:w="85" w:type="dxa"/>
-              <w:bottom w:w="85" w:type="dxa"/>
-              <w:left w:w="120" w:type="dxa"/>
-              <w:right w:w="120" w:type="dxa"/>
-            </w:tcMar>
-          </w:tcPr>
-          <w:p>
-            <w:pPr>
-              <w:spacing w:after="0" w:line="264" w:lineRule="auto"/>
-            </w:pPr>
-            <w:r>
-              <w:rPr>
-                <w:rFonts w:ascii="Arial" w:hAnsi="Arial"/>
-                <w:sz w:val="18"/>
-              </w:rPr>
-              <w:t>Học bổng khuyến khích</w:t>
-            </w:r>
-          </w:p>
-        </w:tc>
-        <w:tc>
-          <w:tcPr>
-            <w:tcW w:type="dxa" w:w="4608"/>
-            <w:shd w:fill="FFFFFF"/>
-            <w:tcMar>
-              <w:top w:w="85" w:type="dxa"/>
-              <w:bottom w:w="85" w:type="dxa"/>
-              <w:left w:w="120" w:type="dxa"/>
-              <w:right w:w="120" w:type="dxa"/>
-            </w:tcMar>
-          </w:tcPr>
-          <w:p>
-            <w:pPr>
-              <w:spacing w:after="0" w:line="264" w:lineRule="auto"/>
-            </w:pPr>
-            <w:r>
-              <w:rPr>
-                <w:rFonts w:ascii="Arial" w:hAnsi="Arial"/>
-                <w:sz w:val="18"/>
-              </w:rPr>
-              <w:t>Điều kiện GPA và DRL để xét học bổng khuyến khích học tập từng học kỳ</w:t>
-            </w:r>
-          </w:p>
-        </w:tc>
-        <w:tc>
-          <w:tcPr>
-            <w:tcW w:type="dxa" w:w="2448"/>
-            <w:shd w:fill="FFFFFF"/>
-            <w:tcMar>
-              <w:top w:w="85" w:type="dxa"/>
-              <w:bottom w:w="85" w:type="dxa"/>
-              <w:left w:w="120" w:type="dxa"/>
-              <w:right w:w="120" w:type="dxa"/>
-            </w:tcMar>
-          </w:tcPr>
-          <w:p>
-            <w:pPr>
-              <w:spacing w:after="0" w:line="264" w:lineRule="auto"/>
-            </w:pPr>
-            <w:r>
-              <w:rPr>
-                <w:rFonts w:ascii="Arial" w:hAnsi="Arial"/>
-                <w:sz w:val="18"/>
-              </w:rPr>
-              <w:t>Quy định học bổng</w:t>
-            </w:r>
-          </w:p>
-        </w:tc>
-      </w:tr>
-    </w:tbl>
-    <w:p>
-      <w:pPr>
-        <w:spacing w:after="80"/>
-      </w:pPr>
     </w:p>
     <w:sectPr>
       <w:pgSz w:w="12240" w:h="15840"/>

</xml_diff>